<commit_message>
Add fundraising income/expenditure tracking with chart visualisation
Adds a new `fundraising` DB table (label, type, year, amount in pence) with full
admin CRUD at /dashboard/fundraising. The public /fundraising page now includes a
live Financial Breakdown section with a grouped bar chart (recharts) and filterable
detail table showing income vs expenditure per year. Documentation updated.

Co-Authored-By: Claude Sonnet 4.6 <noreply@anthropic.com>
</commit_message>
<xml_diff>
--- a/resources/YGGG_PTA_App_Documentation.docx
+++ b/resources/YGGG_PTA_App_Documentation.docx
@@ -342,6 +342,18 @@
           <w:szCs w:val="22"/>
         </w:rPr>
         <w:t xml:space="preserve">    7.3  Manage Events</w:t>
+      </w:r>
+    </w:p>
+    <w:p>
+      <w:pPr>
+        <w:spacing w:after="100"/>
+      </w:pPr>
+      <w:r>
+        <w:rPr>
+          <w:sz w:val="22"/>
+          <w:szCs w:val="22"/>
+        </w:rPr>
+        <w:t xml:space="preserve">    7.4  Fundraising Data</w:t>
       </w:r>
     </w:p>
     <w:p>
@@ -923,29 +935,29 @@
                 <w:sz w:val="20"/>
                 <w:szCs w:val="20"/>
               </w:rPr>
-              <w:t xml:space="preserve">Server Actions</w:t>
-            </w:r>
-          </w:p>
-        </w:tc>
-        <w:tc>
-          <w:tcPr>
-            <w:shd/>
-            <w:tcMar>
-              <w:top w:type="dxa" w:w="80"/>
-              <w:left w:type="dxa" w:w="120"/>
-              <w:bottom w:type="dxa" w:w="80"/>
-              <w:right w:type="dxa" w:w="120"/>
-            </w:tcMar>
-          </w:tcPr>
-          <w:p>
-            <w:r>
-              <w:rPr>
-                <w:b w:val="false"/>
-                <w:bCs w:val="false"/>
-                <w:sz w:val="20"/>
-                <w:szCs w:val="20"/>
-              </w:rPr>
-              <w:t xml:space="preserve">next-safe-action (Zod-validated mutations)</w:t>
+              <w:t xml:space="preserve">Charts</w:t>
+            </w:r>
+          </w:p>
+        </w:tc>
+        <w:tc>
+          <w:tcPr>
+            <w:shd/>
+            <w:tcMar>
+              <w:top w:type="dxa" w:w="80"/>
+              <w:left w:type="dxa" w:w="120"/>
+              <w:bottom w:type="dxa" w:w="80"/>
+              <w:right w:type="dxa" w:w="120"/>
+            </w:tcMar>
+          </w:tcPr>
+          <w:p>
+            <w:r>
+              <w:rPr>
+                <w:b w:val="false"/>
+                <w:bCs w:val="false"/>
+                <w:sz w:val="20"/>
+                <w:szCs w:val="20"/>
+              </w:rPr>
+              <w:t xml:space="preserve">Recharts (fundraising breakdown chart)</w:t>
             </w:r>
           </w:p>
         </w:tc>
@@ -969,6 +981,52 @@
                 <w:sz w:val="20"/>
                 <w:szCs w:val="20"/>
               </w:rPr>
+              <w:t xml:space="preserve">Server Actions</w:t>
+            </w:r>
+          </w:p>
+        </w:tc>
+        <w:tc>
+          <w:tcPr>
+            <w:shd/>
+            <w:tcMar>
+              <w:top w:type="dxa" w:w="80"/>
+              <w:left w:type="dxa" w:w="120"/>
+              <w:bottom w:type="dxa" w:w="80"/>
+              <w:right w:type="dxa" w:w="120"/>
+            </w:tcMar>
+          </w:tcPr>
+          <w:p>
+            <w:r>
+              <w:rPr>
+                <w:b w:val="false"/>
+                <w:bCs w:val="false"/>
+                <w:sz w:val="20"/>
+                <w:szCs w:val="20"/>
+              </w:rPr>
+              <w:t xml:space="preserve">next-safe-action (Zod-validated mutations)</w:t>
+            </w:r>
+          </w:p>
+        </w:tc>
+      </w:tr>
+      <w:tr>
+        <w:tc>
+          <w:tcPr>
+            <w:shd/>
+            <w:tcMar>
+              <w:top w:type="dxa" w:w="80"/>
+              <w:left w:type="dxa" w:w="120"/>
+              <w:bottom w:type="dxa" w:w="80"/>
+              <w:right w:type="dxa" w:w="120"/>
+            </w:tcMar>
+          </w:tcPr>
+          <w:p>
+            <w:r>
+              <w:rPr>
+                <w:b w:val="false"/>
+                <w:bCs w:val="false"/>
+                <w:sz w:val="20"/>
+                <w:szCs w:val="20"/>
+              </w:rPr>
               <w:t xml:space="preserve">Hosting</w:t>
             </w:r>
           </w:p>
@@ -1313,6 +1371,23 @@
       </w:pPr>
       <w:r>
         <w:t xml:space="preserve">/dashboard/events  — Manage existing events</w:t>
+      </w:r>
+    </w:p>
+    <w:p>
+      <w:pPr>
+        <w:pStyle w:val="ListParagraph"/>
+        <w:numPr>
+          <w:ilvl w:val="0"/>
+          <w:numId w:val="1"/>
+        </w:numPr>
+        <w:spacing w:after="60"/>
+        <w:rPr>
+          <w:sz w:val="22"/>
+          <w:szCs w:val="22"/>
+        </w:rPr>
+      </w:pPr>
+      <w:r>
+        <w:t xml:space="preserve">/dashboard/fundraising  — Manage fundraising income/expenditure data</w:t>
       </w:r>
     </w:p>
     <w:p>
@@ -4827,7 +4902,7 @@
           <w:sz w:val="22"/>
           <w:szCs w:val="22"/>
         </w:rPr>
-        <w:t xml:space="preserve">Communicates the three current fundraising priorities to parents and carers.</w:t>
+        <w:t xml:space="preserve">Communicates the three current fundraising priorities to parents and carers. Also displays a live financial breakdown section (Income &amp; Expenditure — Last 3 Years) populated from the fundraising database table, shown as a grouped bar chart and a detailed entry table. The breakdown section is only visible when data has been entered by an admin.</w:t>
       </w:r>
     </w:p>
     <w:p>
@@ -5335,6 +5410,129 @@
           <w:szCs w:val="22"/>
         </w:rPr>
         <w:t xml:space="preserve">Gweld cyflawniadau cymunedol</w:t>
+      </w:r>
+    </w:p>
+    <w:p>
+      <w:pPr>
+        <w:pStyle w:val="Heading3"/>
+        <w:spacing w:after="80" w:before="200"/>
+      </w:pPr>
+      <w:r>
+        <w:t xml:space="preserve">Financial Breakdown Section (dynamic)</w:t>
+      </w:r>
+    </w:p>
+    <w:p>
+      <w:pPr>
+        <w:spacing w:after="100"/>
+      </w:pPr>
+      <w:r>
+        <w:rPr>
+          <w:sz w:val="22"/>
+          <w:szCs w:val="22"/>
+        </w:rPr>
+        <w:t xml:space="preserve">Visible only when fundraising data exists in the database. Contains:</w:t>
+      </w:r>
+    </w:p>
+    <w:p>
+      <w:pPr>
+        <w:pStyle w:val="ListParagraph"/>
+        <w:numPr>
+          <w:ilvl w:val="0"/>
+          <w:numId w:val="1"/>
+        </w:numPr>
+        <w:spacing w:after="60"/>
+        <w:rPr>
+          <w:sz w:val="22"/>
+          <w:szCs w:val="22"/>
+        </w:rPr>
+      </w:pPr>
+      <w:r>
+        <w:t xml:space="preserve">Section heading: Income &amp; Expenditure — Last 3 Years / Incwm a Gwariant — 3 Blynedd Diwethaf</w:t>
+      </w:r>
+    </w:p>
+    <w:p>
+      <w:pPr>
+        <w:pStyle w:val="ListParagraph"/>
+        <w:numPr>
+          <w:ilvl w:val="0"/>
+          <w:numId w:val="1"/>
+        </w:numPr>
+        <w:spacing w:after="60"/>
+        <w:rPr>
+          <w:sz w:val="22"/>
+          <w:szCs w:val="22"/>
+        </w:rPr>
+      </w:pPr>
+      <w:r>
+        <w:t xml:space="preserve">Grouped bar chart (Recharts): one bar pair per year — Income (purple) and Expenditure (yellow-amber)</w:t>
+      </w:r>
+    </w:p>
+    <w:p>
+      <w:pPr>
+        <w:pStyle w:val="ListParagraph"/>
+        <w:numPr>
+          <w:ilvl w:val="0"/>
+          <w:numId w:val="1"/>
+        </w:numPr>
+        <w:spacing w:after="60"/>
+        <w:rPr>
+          <w:sz w:val="22"/>
+          <w:szCs w:val="22"/>
+        </w:rPr>
+      </w:pPr>
+      <w:r>
+        <w:t xml:space="preserve">Year filter tabs: All Years / individual years</w:t>
+      </w:r>
+    </w:p>
+    <w:p>
+      <w:pPr>
+        <w:pStyle w:val="ListParagraph"/>
+        <w:numPr>
+          <w:ilvl w:val="0"/>
+          <w:numId w:val="1"/>
+        </w:numPr>
+        <w:spacing w:after="60"/>
+        <w:rPr>
+          <w:sz w:val="22"/>
+          <w:szCs w:val="22"/>
+        </w:rPr>
+      </w:pPr>
+      <w:r>
+        <w:t xml:space="preserve">Detail table: each entry listed by year with type badge (Income / Expenditure) and amount</w:t>
+      </w:r>
+    </w:p>
+    <w:p>
+      <w:pPr>
+        <w:pStyle w:val="ListParagraph"/>
+        <w:numPr>
+          <w:ilvl w:val="0"/>
+          <w:numId w:val="1"/>
+        </w:numPr>
+        <w:spacing w:after="60"/>
+        <w:rPr>
+          <w:sz w:val="22"/>
+          <w:szCs w:val="22"/>
+        </w:rPr>
+      </w:pPr>
+      <w:r>
+        <w:t xml:space="preserve">Row totals per year showing income / expenditure side-by-side</w:t>
+      </w:r>
+    </w:p>
+    <w:p>
+      <w:pPr>
+        <w:pStyle w:val="ListParagraph"/>
+        <w:numPr>
+          <w:ilvl w:val="0"/>
+          <w:numId w:val="1"/>
+        </w:numPr>
+        <w:spacing w:after="60"/>
+        <w:rPr>
+          <w:sz w:val="22"/>
+          <w:szCs w:val="22"/>
+        </w:rPr>
+      </w:pPr>
+      <w:r>
+        <w:t xml:space="preserve">All labels bilingual (English / Welsh)</w:t>
       </w:r>
     </w:p>
     <w:p>
@@ -8041,26 +8239,6 @@
       </w:r>
     </w:p>
     <w:p>
-      <w:r>
-        <w:br w:type="page"/>
-      </w:r>
-    </w:p>
-    <w:p>
-      <w:pPr>
-        <w:pStyle w:val="Heading1"/>
-        <w:shd w:fill="EDE9FE" w:val="clear"/>
-        <w:spacing w:after="200" w:before="400"/>
-        <w:rPr>
-          <w:b/>
-          <w:bCs/>
-          <w:color w:val="5B21B6"/>
-        </w:rPr>
-      </w:pPr>
-      <w:r>
-        <w:t xml:space="preserve">8. Key Functionality</w:t>
-      </w:r>
-    </w:p>
-    <w:p>
       <w:pPr>
         <w:pStyle w:val="Heading2"/>
         <w:spacing w:after="120" w:before="300"/>
@@ -8069,7 +8247,16 @@
         </w:rPr>
       </w:pPr>
       <w:r>
-        <w:t xml:space="preserve">Authentication &amp; Roles</w:t>
+        <w:t xml:space="preserve">7.4  Fundraising Data  (/dashboard/fundraising)</w:t>
+      </w:r>
+    </w:p>
+    <w:p>
+      <w:pPr>
+        <w:pStyle w:val="Heading3"/>
+        <w:spacing w:after="80" w:before="200"/>
+      </w:pPr>
+      <w:r>
+        <w:t xml:space="preserve">Purpose</w:t>
       </w:r>
     </w:p>
     <w:p>
@@ -8081,7 +8268,16 @@
           <w:sz w:val="22"/>
           <w:szCs w:val="22"/>
         </w:rPr>
-        <w:t xml:space="preserve">Authentication is handled by Clerk. Two roles exist:</w:t>
+        <w:t xml:space="preserve">Allows admins to enter, edit, and delete fundraising income and expenditure records for the last 3 years. This data powers the Financial Breakdown chart on the public Fundraising page.</w:t>
+      </w:r>
+    </w:p>
+    <w:p>
+      <w:pPr>
+        <w:pStyle w:val="Heading3"/>
+        <w:spacing w:after="80" w:before="200"/>
+      </w:pPr>
+      <w:r>
+        <w:t xml:space="preserve">Form Fields</w:t>
       </w:r>
     </w:p>
     <w:tbl>
@@ -8119,7 +8315,7 @@
                 <w:sz w:val="20"/>
                 <w:szCs w:val="20"/>
               </w:rPr>
-              <w:t xml:space="preserve">Role</w:t>
+              <w:t xml:space="preserve">Field</w:t>
             </w:r>
           </w:p>
         </w:tc>
@@ -8141,7 +8337,7 @@
                 <w:sz w:val="20"/>
                 <w:szCs w:val="20"/>
               </w:rPr>
-              <w:t xml:space="preserve">Capabilities</w:t>
+              <w:t xml:space="preserve">Notes</w:t>
             </w:r>
           </w:p>
         </w:tc>
@@ -8165,29 +8361,29 @@
                 <w:sz w:val="20"/>
                 <w:szCs w:val="20"/>
               </w:rPr>
-              <w:t xml:space="preserve">member (any signed-in user)</w:t>
-            </w:r>
-          </w:p>
-        </w:tc>
-        <w:tc>
-          <w:tcPr>
-            <w:shd/>
-            <w:tcMar>
-              <w:top w:type="dxa" w:w="80"/>
-              <w:left w:type="dxa" w:w="120"/>
-              <w:bottom w:type="dxa" w:w="80"/>
-              <w:right w:type="dxa" w:w="120"/>
-            </w:tcMar>
-          </w:tcPr>
-          <w:p>
-            <w:r>
-              <w:rPr>
-                <w:b w:val="false"/>
-                <w:bCs w:val="false"/>
-                <w:sz w:val="20"/>
-                <w:szCs w:val="20"/>
-              </w:rPr>
-              <w:t xml:space="preserve">Browse events, purchase tickets, view own orders</w:t>
+              <w:t xml:space="preserve">Event / Item Name</w:t>
+            </w:r>
+          </w:p>
+        </w:tc>
+        <w:tc>
+          <w:tcPr>
+            <w:shd/>
+            <w:tcMar>
+              <w:top w:type="dxa" w:w="80"/>
+              <w:left w:type="dxa" w:w="120"/>
+              <w:bottom w:type="dxa" w:w="80"/>
+              <w:right w:type="dxa" w:w="120"/>
+            </w:tcMar>
+          </w:tcPr>
+          <w:p>
+            <w:r>
+              <w:rPr>
+                <w:b w:val="false"/>
+                <w:bCs w:val="false"/>
+                <w:sz w:val="20"/>
+                <w:szCs w:val="20"/>
+              </w:rPr>
+              <w:t xml:space="preserve">Free text — e.g. 'Summer Disco' or 'Reading Books'</w:t>
             </w:r>
           </w:p>
         </w:tc>
@@ -8211,29 +8407,121 @@
                 <w:sz w:val="20"/>
                 <w:szCs w:val="20"/>
               </w:rPr>
-              <w:t xml:space="preserve">admin</w:t>
-            </w:r>
-          </w:p>
-        </w:tc>
-        <w:tc>
-          <w:tcPr>
-            <w:shd/>
-            <w:tcMar>
-              <w:top w:type="dxa" w:w="80"/>
-              <w:left w:type="dxa" w:w="120"/>
-              <w:bottom w:type="dxa" w:w="80"/>
-              <w:right w:type="dxa" w:w="120"/>
-            </w:tcMar>
-          </w:tcPr>
-          <w:p>
-            <w:r>
-              <w:rPr>
-                <w:b w:val="false"/>
-                <w:bCs w:val="false"/>
-                <w:sz w:val="20"/>
-                <w:szCs w:val="20"/>
-              </w:rPr>
-              <w:t xml:space="preserve">All of the above plus: create/edit/delete events, view analytics</w:t>
+              <w:t xml:space="preserve">Type</w:t>
+            </w:r>
+          </w:p>
+        </w:tc>
+        <w:tc>
+          <w:tcPr>
+            <w:shd/>
+            <w:tcMar>
+              <w:top w:type="dxa" w:w="80"/>
+              <w:left w:type="dxa" w:w="120"/>
+              <w:bottom w:type="dxa" w:w="80"/>
+              <w:right w:type="dxa" w:w="120"/>
+            </w:tcMar>
+          </w:tcPr>
+          <w:p>
+            <w:r>
+              <w:rPr>
+                <w:b w:val="false"/>
+                <w:bCs w:val="false"/>
+                <w:sz w:val="20"/>
+                <w:szCs w:val="20"/>
+              </w:rPr>
+              <w:t xml:space="preserve">Select: Income (Raised) or Expenditure (Spent)</w:t>
+            </w:r>
+          </w:p>
+        </w:tc>
+      </w:tr>
+      <w:tr>
+        <w:tc>
+          <w:tcPr>
+            <w:shd/>
+            <w:tcMar>
+              <w:top w:type="dxa" w:w="80"/>
+              <w:left w:type="dxa" w:w="120"/>
+              <w:bottom w:type="dxa" w:w="80"/>
+              <w:right w:type="dxa" w:w="120"/>
+            </w:tcMar>
+          </w:tcPr>
+          <w:p>
+            <w:r>
+              <w:rPr>
+                <w:b w:val="false"/>
+                <w:bCs w:val="false"/>
+                <w:sz w:val="20"/>
+                <w:szCs w:val="20"/>
+              </w:rPr>
+              <w:t xml:space="preserve">Year</w:t>
+            </w:r>
+          </w:p>
+        </w:tc>
+        <w:tc>
+          <w:tcPr>
+            <w:shd/>
+            <w:tcMar>
+              <w:top w:type="dxa" w:w="80"/>
+              <w:left w:type="dxa" w:w="120"/>
+              <w:bottom w:type="dxa" w:w="80"/>
+              <w:right w:type="dxa" w:w="120"/>
+            </w:tcMar>
+          </w:tcPr>
+          <w:p>
+            <w:r>
+              <w:rPr>
+                <w:b w:val="false"/>
+                <w:bCs w:val="false"/>
+                <w:sz w:val="20"/>
+                <w:szCs w:val="20"/>
+              </w:rPr>
+              <w:t xml:space="preserve">Integer — e.g. 2023, 2024, 2025</w:t>
+            </w:r>
+          </w:p>
+        </w:tc>
+      </w:tr>
+      <w:tr>
+        <w:tc>
+          <w:tcPr>
+            <w:shd/>
+            <w:tcMar>
+              <w:top w:type="dxa" w:w="80"/>
+              <w:left w:type="dxa" w:w="120"/>
+              <w:bottom w:type="dxa" w:w="80"/>
+              <w:right w:type="dxa" w:w="120"/>
+            </w:tcMar>
+          </w:tcPr>
+          <w:p>
+            <w:r>
+              <w:rPr>
+                <w:b w:val="false"/>
+                <w:bCs w:val="false"/>
+                <w:sz w:val="20"/>
+                <w:szCs w:val="20"/>
+              </w:rPr>
+              <w:t xml:space="preserve">Amount (£)</w:t>
+            </w:r>
+          </w:p>
+        </w:tc>
+        <w:tc>
+          <w:tcPr>
+            <w:shd/>
+            <w:tcMar>
+              <w:top w:type="dxa" w:w="80"/>
+              <w:left w:type="dxa" w:w="120"/>
+              <w:bottom w:type="dxa" w:w="80"/>
+              <w:right w:type="dxa" w:w="120"/>
+            </w:tcMar>
+          </w:tcPr>
+          <w:p>
+            <w:r>
+              <w:rPr>
+                <w:b w:val="false"/>
+                <w:bCs w:val="false"/>
+                <w:sz w:val="20"/>
+                <w:szCs w:val="20"/>
+              </w:rPr>
+              <w:t xml:space="preserve">Decimal pounds — stored as pence in the database</w:t>
             </w:r>
           </w:p>
         </w:tc>
@@ -8246,14 +8534,116 @@
     </w:p>
     <w:p>
       <w:pPr>
-        <w:spacing w:after="100"/>
-      </w:pPr>
-      <w:r>
-        <w:rPr>
-          <w:sz w:val="22"/>
-          <w:szCs w:val="22"/>
-        </w:rPr>
-        <w:t xml:space="preserve">Role is stored in Clerk JWT session metadata under sessionClaims.metadata.role. Route protection is enforced in middleware.ts.</w:t>
+        <w:pStyle w:val="Heading3"/>
+        <w:spacing w:after="80" w:before="200"/>
+      </w:pPr>
+      <w:r>
+        <w:t xml:space="preserve">Features</w:t>
+      </w:r>
+    </w:p>
+    <w:p>
+      <w:pPr>
+        <w:pStyle w:val="ListParagraph"/>
+        <w:numPr>
+          <w:ilvl w:val="0"/>
+          <w:numId w:val="1"/>
+        </w:numPr>
+        <w:spacing w:after="60"/>
+        <w:rPr>
+          <w:sz w:val="22"/>
+          <w:szCs w:val="22"/>
+        </w:rPr>
+      </w:pPr>
+      <w:r>
+        <w:t xml:space="preserve">Add Entry button opens an inline form card</w:t>
+      </w:r>
+    </w:p>
+    <w:p>
+      <w:pPr>
+        <w:pStyle w:val="ListParagraph"/>
+        <w:numPr>
+          <w:ilvl w:val="0"/>
+          <w:numId w:val="1"/>
+        </w:numPr>
+        <w:spacing w:after="60"/>
+        <w:rPr>
+          <w:sz w:val="22"/>
+          <w:szCs w:val="22"/>
+        </w:rPr>
+      </w:pPr>
+      <w:r>
+        <w:t xml:space="preserve">Edit button pre-populates the form with the selected entry</w:t>
+      </w:r>
+    </w:p>
+    <w:p>
+      <w:pPr>
+        <w:pStyle w:val="ListParagraph"/>
+        <w:numPr>
+          <w:ilvl w:val="0"/>
+          <w:numId w:val="1"/>
+        </w:numPr>
+        <w:spacing w:after="60"/>
+        <w:rPr>
+          <w:sz w:val="22"/>
+          <w:szCs w:val="22"/>
+        </w:rPr>
+      </w:pPr>
+      <w:r>
+        <w:t xml:space="preserve">Delete button removes the entry immediately with a toast confirmation</w:t>
+      </w:r>
+    </w:p>
+    <w:p>
+      <w:pPr>
+        <w:pStyle w:val="ListParagraph"/>
+        <w:numPr>
+          <w:ilvl w:val="0"/>
+          <w:numId w:val="1"/>
+        </w:numPr>
+        <w:spacing w:after="60"/>
+        <w:rPr>
+          <w:sz w:val="22"/>
+          <w:szCs w:val="22"/>
+        </w:rPr>
+      </w:pPr>
+      <w:r>
+        <w:t xml:space="preserve">Year filter tabs to view entries by year or all years</w:t>
+      </w:r>
+    </w:p>
+    <w:p>
+      <w:pPr>
+        <w:pStyle w:val="ListParagraph"/>
+        <w:numPr>
+          <w:ilvl w:val="0"/>
+          <w:numId w:val="1"/>
+        </w:numPr>
+        <w:spacing w:after="60"/>
+        <w:rPr>
+          <w:sz w:val="22"/>
+          <w:szCs w:val="22"/>
+        </w:rPr>
+      </w:pPr>
+      <w:r>
+        <w:t xml:space="preserve">Per-year summary row showing total income vs total expenditure</w:t>
+      </w:r>
+    </w:p>
+    <w:p>
+      <w:r>
+        <w:br w:type="page"/>
+      </w:r>
+    </w:p>
+    <w:p>
+      <w:pPr>
+        <w:pStyle w:val="Heading1"/>
+        <w:shd w:fill="EDE9FE" w:val="clear"/>
+        <w:spacing w:after="200" w:before="400"/>
+        <w:rPr>
+          <w:b/>
+          <w:bCs/>
+          <w:color w:val="5B21B6"/>
+        </w:rPr>
+      </w:pPr>
+      <w:r>
+        <w:t xml:space="preserve">8. Key Functionality</w:t>
       </w:r>
     </w:p>
     <w:p>
@@ -8265,315 +8655,7 @@
         </w:rPr>
       </w:pPr>
       <w:r>
-        <w:t xml:space="preserve">Cart &amp; Ticket Purchase</w:t>
-      </w:r>
-    </w:p>
-    <w:p>
-      <w:pPr>
-        <w:pStyle w:val="ListParagraph"/>
-        <w:numPr>
-          <w:ilvl w:val="0"/>
-          <w:numId w:val="1"/>
-        </w:numPr>
-        <w:spacing w:after="60"/>
-        <w:rPr>
-          <w:sz w:val="22"/>
-          <w:szCs w:val="22"/>
-        </w:rPr>
-      </w:pPr>
-      <w:r>
-        <w:t xml:space="preserve">Users add tickets to a Zustand cart (persisted to localStorage)</w:t>
-      </w:r>
-    </w:p>
-    <w:p>
-      <w:pPr>
-        <w:pStyle w:val="ListParagraph"/>
-        <w:numPr>
-          <w:ilvl w:val="0"/>
-          <w:numId w:val="1"/>
-        </w:numPr>
-        <w:spacing w:after="60"/>
-        <w:rPr>
-          <w:sz w:val="22"/>
-          <w:szCs w:val="22"/>
-        </w:rPr>
-      </w:pPr>
-      <w:r>
-        <w:t xml:space="preserve">Cart supports multiple events and quantities</w:t>
-      </w:r>
-    </w:p>
-    <w:p>
-      <w:pPr>
-        <w:pStyle w:val="ListParagraph"/>
-        <w:numPr>
-          <w:ilvl w:val="0"/>
-          <w:numId w:val="1"/>
-        </w:numPr>
-        <w:spacing w:after="60"/>
-        <w:rPr>
-          <w:sz w:val="22"/>
-          <w:szCs w:val="22"/>
-        </w:rPr>
-      </w:pPr>
-      <w:r>
-        <w:t xml:space="preserve">Checkout requires authentication (unauthenticated users prompted to sign in)</w:t>
-      </w:r>
-    </w:p>
-    <w:p>
-      <w:pPr>
-        <w:pStyle w:val="ListParagraph"/>
-        <w:numPr>
-          <w:ilvl w:val="0"/>
-          <w:numId w:val="1"/>
-        </w:numPr>
-        <w:spacing w:after="60"/>
-        <w:rPr>
-          <w:sz w:val="22"/>
-          <w:szCs w:val="22"/>
-        </w:rPr>
-      </w:pPr>
-      <w:r>
-        <w:t xml:space="preserve">Ticket holder names are collected per ticket before payment</w:t>
-      </w:r>
-    </w:p>
-    <w:p>
-      <w:pPr>
-        <w:pStyle w:val="ListParagraph"/>
-        <w:numPr>
-          <w:ilvl w:val="0"/>
-          <w:numId w:val="1"/>
-        </w:numPr>
-        <w:spacing w:after="60"/>
-        <w:rPr>
-          <w:sz w:val="22"/>
-          <w:szCs w:val="22"/>
-        </w:rPr>
-      </w:pPr>
-      <w:r>
-        <w:t xml:space="preserve">Payment is processed via Stripe</w:t>
-      </w:r>
-    </w:p>
-    <w:p>
-      <w:pPr>
-        <w:pStyle w:val="ListParagraph"/>
-        <w:numPr>
-          <w:ilvl w:val="0"/>
-          <w:numId w:val="1"/>
-        </w:numPr>
-        <w:spacing w:after="60"/>
-        <w:rPr>
-          <w:sz w:val="22"/>
-          <w:szCs w:val="22"/>
-        </w:rPr>
-      </w:pPr>
-      <w:r>
-        <w:t xml:space="preserve">On success, an order record is created in the database with individual ticket records</w:t>
-      </w:r>
-    </w:p>
-    <w:p>
-      <w:pPr>
-        <w:pStyle w:val="ListParagraph"/>
-        <w:numPr>
-          <w:ilvl w:val="0"/>
-          <w:numId w:val="1"/>
-        </w:numPr>
-        <w:spacing w:after="60"/>
-        <w:rPr>
-          <w:sz w:val="22"/>
-          <w:szCs w:val="22"/>
-        </w:rPr>
-      </w:pPr>
-      <w:r>
-        <w:t xml:space="preserve">A confirmation screen is shown with a link to the user's orders</w:t>
-      </w:r>
-    </w:p>
-    <w:p>
-      <w:pPr>
-        <w:pStyle w:val="Heading2"/>
-        <w:spacing w:after="120" w:before="300"/>
-        <w:rPr>
-          <w:color w:val="5B21B6"/>
-        </w:rPr>
-      </w:pPr>
-      <w:r>
-        <w:t xml:space="preserve">Bilingual Content</w:t>
-      </w:r>
-    </w:p>
-    <w:p>
-      <w:pPr>
-        <w:pStyle w:val="ListParagraph"/>
-        <w:numPr>
-          <w:ilvl w:val="0"/>
-          <w:numId w:val="1"/>
-        </w:numPr>
-        <w:spacing w:after="60"/>
-        <w:rPr>
-          <w:sz w:val="22"/>
-          <w:szCs w:val="22"/>
-        </w:rPr>
-      </w:pPr>
-      <w:r>
-        <w:t xml:space="preserve">A LanguageProvider component wraps the entire application</w:t>
-      </w:r>
-    </w:p>
-    <w:p>
-      <w:pPr>
-        <w:pStyle w:val="ListParagraph"/>
-        <w:numPr>
-          <w:ilvl w:val="0"/>
-          <w:numId w:val="1"/>
-        </w:numPr>
-        <w:spacing w:after="60"/>
-        <w:rPr>
-          <w:sz w:val="22"/>
-          <w:szCs w:val="22"/>
-        </w:rPr>
-      </w:pPr>
-      <w:r>
-        <w:t xml:space="preserve">Language preference (en / cy) is persisted to localStorage</w:t>
-      </w:r>
-    </w:p>
-    <w:p>
-      <w:pPr>
-        <w:pStyle w:val="ListParagraph"/>
-        <w:numPr>
-          <w:ilvl w:val="0"/>
-          <w:numId w:val="1"/>
-        </w:numPr>
-        <w:spacing w:after="60"/>
-        <w:rPr>
-          <w:sz w:val="22"/>
-          <w:szCs w:val="22"/>
-        </w:rPr>
-      </w:pPr>
-      <w:r>
-        <w:t xml:space="preserve">All user-facing text has an English and Welsh version</w:t>
-      </w:r>
-    </w:p>
-    <w:p>
-      <w:pPr>
-        <w:pStyle w:val="ListParagraph"/>
-        <w:numPr>
-          <w:ilvl w:val="0"/>
-          <w:numId w:val="1"/>
-        </w:numPr>
-        <w:spacing w:after="60"/>
-        <w:rPr>
-          <w:sz w:val="22"/>
-          <w:szCs w:val="22"/>
-        </w:rPr>
-      </w:pPr>
-      <w:r>
-        <w:t xml:space="preserve">Event images also have bilingual variants (imgUrl / imgUrlWel) stored per event</w:t>
-      </w:r>
-    </w:p>
-    <w:p>
-      <w:pPr>
-        <w:pStyle w:val="ListParagraph"/>
-        <w:numPr>
-          <w:ilvl w:val="0"/>
-          <w:numId w:val="1"/>
-        </w:numPr>
-        <w:spacing w:after="60"/>
-        <w:rPr>
-          <w:sz w:val="22"/>
-          <w:szCs w:val="22"/>
-        </w:rPr>
-      </w:pPr>
-      <w:r>
-        <w:t xml:space="preserve">Admin users upload separate English and Welsh event images</w:t>
-      </w:r>
-    </w:p>
-    <w:p>
-      <w:pPr>
-        <w:pStyle w:val="Heading2"/>
-        <w:spacing w:after="120" w:before="300"/>
-        <w:rPr>
-          <w:color w:val="5B21B6"/>
-        </w:rPr>
-      </w:pPr>
-      <w:r>
-        <w:t xml:space="preserve">Event Management</w:t>
-      </w:r>
-    </w:p>
-    <w:p>
-      <w:pPr>
-        <w:pStyle w:val="ListParagraph"/>
-        <w:numPr>
-          <w:ilvl w:val="0"/>
-          <w:numId w:val="1"/>
-        </w:numPr>
-        <w:spacing w:after="60"/>
-        <w:rPr>
-          <w:sz w:val="22"/>
-          <w:szCs w:val="22"/>
-        </w:rPr>
-      </w:pPr>
-      <w:r>
-        <w:t xml:space="preserve">Admins create events with name, description, price, capacity, start/end dates, location, and map link</w:t>
-      </w:r>
-    </w:p>
-    <w:p>
-      <w:pPr>
-        <w:pStyle w:val="ListParagraph"/>
-        <w:numPr>
-          <w:ilvl w:val="0"/>
-          <w:numId w:val="1"/>
-        </w:numPr>
-        <w:spacing w:after="60"/>
-        <w:rPr>
-          <w:sz w:val="22"/>
-          <w:szCs w:val="22"/>
-        </w:rPr>
-      </w:pPr>
-      <w:r>
-        <w:t xml:space="preserve">Events display availability badges based on remaining capacity</w:t>
-      </w:r>
-    </w:p>
-    <w:p>
-      <w:pPr>
-        <w:pStyle w:val="ListParagraph"/>
-        <w:numPr>
-          <w:ilvl w:val="0"/>
-          <w:numId w:val="1"/>
-        </w:numPr>
-        <w:spacing w:after="60"/>
-        <w:rPr>
-          <w:sz w:val="22"/>
-          <w:szCs w:val="22"/>
-        </w:rPr>
-      </w:pPr>
-      <w:r>
-        <w:t xml:space="preserve">Events past their end date are automatically marked as Expired</w:t>
-      </w:r>
-    </w:p>
-    <w:p>
-      <w:pPr>
-        <w:pStyle w:val="ListParagraph"/>
-        <w:numPr>
-          <w:ilvl w:val="0"/>
-          <w:numId w:val="1"/>
-        </w:numPr>
-        <w:spacing w:after="60"/>
-        <w:rPr>
-          <w:sz w:val="22"/>
-          <w:szCs w:val="22"/>
-        </w:rPr>
-      </w:pPr>
-      <w:r>
-        <w:t xml:space="preserve">Event images are served in the user's selected language</w:t>
-      </w:r>
-    </w:p>
-    <w:p>
-      <w:pPr>
-        <w:pStyle w:val="Heading2"/>
-        <w:spacing w:after="120" w:before="300"/>
-        <w:rPr>
-          <w:color w:val="5B21B6"/>
-        </w:rPr>
-      </w:pPr>
-      <w:r>
-        <w:t xml:space="preserve">Data Layer</w:t>
+        <w:t xml:space="preserve">Authentication &amp; Roles</w:t>
       </w:r>
     </w:p>
     <w:p>
@@ -8585,7 +8667,7 @@
           <w:sz w:val="22"/>
           <w:szCs w:val="22"/>
         </w:rPr>
-        <w:t xml:space="preserve">Four database tables:</w:t>
+        <w:t xml:space="preserve">Authentication is handled by Clerk. Two roles exist:</w:t>
       </w:r>
     </w:p>
     <w:tbl>
@@ -8623,7 +8705,7 @@
                 <w:sz w:val="20"/>
                 <w:szCs w:val="20"/>
               </w:rPr>
-              <w:t xml:space="preserve">Table</w:t>
+              <w:t xml:space="preserve">Role</w:t>
             </w:r>
           </w:p>
         </w:tc>
@@ -8645,7 +8727,7 @@
                 <w:sz w:val="20"/>
                 <w:szCs w:val="20"/>
               </w:rPr>
-              <w:t xml:space="preserve">Key columns</w:t>
+              <w:t xml:space="preserve">Capabilities</w:t>
             </w:r>
           </w:p>
         </w:tc>
@@ -8669,29 +8751,29 @@
                 <w:sz w:val="20"/>
                 <w:szCs w:val="20"/>
               </w:rPr>
-              <w:t xml:space="preserve">users</w:t>
-            </w:r>
-          </w:p>
-        </w:tc>
-        <w:tc>
-          <w:tcPr>
-            <w:shd/>
-            <w:tcMar>
-              <w:top w:type="dxa" w:w="80"/>
-              <w:left w:type="dxa" w:w="120"/>
-              <w:bottom w:type="dxa" w:w="80"/>
-              <w:right w:type="dxa" w:w="120"/>
-            </w:tcMar>
-          </w:tcPr>
-          <w:p>
-            <w:r>
-              <w:rPr>
-                <w:b w:val="false"/>
-                <w:bCs w:val="false"/>
-                <w:sz w:val="20"/>
-                <w:szCs w:val="20"/>
-              </w:rPr>
-              <w:t xml:space="preserve">id, clerkId, name, email, role</w:t>
+              <w:t xml:space="preserve">member (any signed-in user)</w:t>
+            </w:r>
+          </w:p>
+        </w:tc>
+        <w:tc>
+          <w:tcPr>
+            <w:shd/>
+            <w:tcMar>
+              <w:top w:type="dxa" w:w="80"/>
+              <w:left w:type="dxa" w:w="120"/>
+              <w:bottom w:type="dxa" w:w="80"/>
+              <w:right w:type="dxa" w:w="120"/>
+            </w:tcMar>
+          </w:tcPr>
+          <w:p>
+            <w:r>
+              <w:rPr>
+                <w:b w:val="false"/>
+                <w:bCs w:val="false"/>
+                <w:sz w:val="20"/>
+                <w:szCs w:val="20"/>
+              </w:rPr>
+              <w:t xml:space="preserve">Browse events, purchase tickets, view own orders</w:t>
             </w:r>
           </w:p>
         </w:tc>
@@ -8715,121 +8797,29 @@
                 <w:sz w:val="20"/>
                 <w:szCs w:val="20"/>
               </w:rPr>
-              <w:t xml:space="preserve">events</w:t>
-            </w:r>
-          </w:p>
-        </w:tc>
-        <w:tc>
-          <w:tcPr>
-            <w:shd/>
-            <w:tcMar>
-              <w:top w:type="dxa" w:w="80"/>
-              <w:left w:type="dxa" w:w="120"/>
-              <w:bottom w:type="dxa" w:w="80"/>
-              <w:right w:type="dxa" w:w="120"/>
-            </w:tcMar>
-          </w:tcPr>
-          <w:p>
-            <w:r>
-              <w:rPr>
-                <w:b w:val="false"/>
-                <w:bCs w:val="false"/>
-                <w:sz w:val="20"/>
-                <w:szCs w:val="20"/>
-              </w:rPr>
-              <w:t xml:space="preserve">id, name, description, price, capacity, startDate, endDate, location, mapsLink, imgUrl, imgUrlWel</w:t>
-            </w:r>
-          </w:p>
-        </w:tc>
-      </w:tr>
-      <w:tr>
-        <w:tc>
-          <w:tcPr>
-            <w:shd/>
-            <w:tcMar>
-              <w:top w:type="dxa" w:w="80"/>
-              <w:left w:type="dxa" w:w="120"/>
-              <w:bottom w:type="dxa" w:w="80"/>
-              <w:right w:type="dxa" w:w="120"/>
-            </w:tcMar>
-          </w:tcPr>
-          <w:p>
-            <w:r>
-              <w:rPr>
-                <w:b w:val="false"/>
-                <w:bCs w:val="false"/>
-                <w:sz w:val="20"/>
-                <w:szCs w:val="20"/>
-              </w:rPr>
-              <w:t xml:space="preserve">orders</w:t>
-            </w:r>
-          </w:p>
-        </w:tc>
-        <w:tc>
-          <w:tcPr>
-            <w:shd/>
-            <w:tcMar>
-              <w:top w:type="dxa" w:w="80"/>
-              <w:left w:type="dxa" w:w="120"/>
-              <w:bottom w:type="dxa" w:w="80"/>
-              <w:right w:type="dxa" w:w="120"/>
-            </w:tcMar>
-          </w:tcPr>
-          <w:p>
-            <w:r>
-              <w:rPr>
-                <w:b w:val="false"/>
-                <w:bCs w:val="false"/>
-                <w:sz w:val="20"/>
-                <w:szCs w:val="20"/>
-              </w:rPr>
-              <w:t xml:space="preserve">id, userId, eventId, orderRef, status, totalAmount, createdAt</w:t>
-            </w:r>
-          </w:p>
-        </w:tc>
-      </w:tr>
-      <w:tr>
-        <w:tc>
-          <w:tcPr>
-            <w:shd/>
-            <w:tcMar>
-              <w:top w:type="dxa" w:w="80"/>
-              <w:left w:type="dxa" w:w="120"/>
-              <w:bottom w:type="dxa" w:w="80"/>
-              <w:right w:type="dxa" w:w="120"/>
-            </w:tcMar>
-          </w:tcPr>
-          <w:p>
-            <w:r>
-              <w:rPr>
-                <w:b w:val="false"/>
-                <w:bCs w:val="false"/>
-                <w:sz w:val="20"/>
-                <w:szCs w:val="20"/>
-              </w:rPr>
-              <w:t xml:space="preserve">tickets</w:t>
-            </w:r>
-          </w:p>
-        </w:tc>
-        <w:tc>
-          <w:tcPr>
-            <w:shd/>
-            <w:tcMar>
-              <w:top w:type="dxa" w:w="80"/>
-              <w:left w:type="dxa" w:w="120"/>
-              <w:bottom w:type="dxa" w:w="80"/>
-              <w:right w:type="dxa" w:w="120"/>
-            </w:tcMar>
-          </w:tcPr>
-          <w:p>
-            <w:r>
-              <w:rPr>
-                <w:b w:val="false"/>
-                <w:bCs w:val="false"/>
-                <w:sz w:val="20"/>
-                <w:szCs w:val="20"/>
-              </w:rPr>
-              <w:t xml:space="preserve">id, orderId, eventId, ticketHolderName</w:t>
+              <w:t xml:space="preserve">admin</w:t>
+            </w:r>
+          </w:p>
+        </w:tc>
+        <w:tc>
+          <w:tcPr>
+            <w:shd/>
+            <w:tcMar>
+              <w:top w:type="dxa" w:w="80"/>
+              <w:left w:type="dxa" w:w="120"/>
+              <w:bottom w:type="dxa" w:w="80"/>
+              <w:right w:type="dxa" w:w="120"/>
+            </w:tcMar>
+          </w:tcPr>
+          <w:p>
+            <w:r>
+              <w:rPr>
+                <w:b w:val="false"/>
+                <w:bCs w:val="false"/>
+                <w:sz w:val="20"/>
+                <w:szCs w:val="20"/>
+              </w:rPr>
+              <w:t xml:space="preserve">All of the above plus: create/edit/delete events, view analytics, manage fundraising data</w:t>
             </w:r>
           </w:p>
         </w:tc>
@@ -8841,23 +8831,449 @@
       </w:pPr>
     </w:p>
     <w:p>
-      <w:r>
-        <w:br w:type="page"/>
-      </w:r>
-    </w:p>
-    <w:p>
-      <w:pPr>
-        <w:pStyle w:val="Heading1"/>
-        <w:shd w:fill="EDE9FE" w:val="clear"/>
-        <w:spacing w:after="200" w:before="400"/>
-        <w:rPr>
-          <w:b/>
-          <w:bCs/>
+      <w:pPr>
+        <w:spacing w:after="100"/>
+      </w:pPr>
+      <w:r>
+        <w:rPr>
+          <w:sz w:val="22"/>
+          <w:szCs w:val="22"/>
+        </w:rPr>
+        <w:t xml:space="preserve">Role is stored in Clerk JWT session metadata under sessionClaims.metadata.role. Route protection is enforced in middleware.ts.</w:t>
+      </w:r>
+    </w:p>
+    <w:p>
+      <w:pPr>
+        <w:pStyle w:val="Heading2"/>
+        <w:spacing w:after="120" w:before="300"/>
+        <w:rPr>
           <w:color w:val="5B21B6"/>
         </w:rPr>
       </w:pPr>
       <w:r>
-        <w:t xml:space="preserve">9. Bilingual Content Reference</w:t>
+        <w:t xml:space="preserve">Cart &amp; Ticket Purchase</w:t>
+      </w:r>
+    </w:p>
+    <w:p>
+      <w:pPr>
+        <w:pStyle w:val="ListParagraph"/>
+        <w:numPr>
+          <w:ilvl w:val="0"/>
+          <w:numId w:val="1"/>
+        </w:numPr>
+        <w:spacing w:after="60"/>
+        <w:rPr>
+          <w:sz w:val="22"/>
+          <w:szCs w:val="22"/>
+        </w:rPr>
+      </w:pPr>
+      <w:r>
+        <w:t xml:space="preserve">Users add tickets to a Zustand cart (persisted to localStorage)</w:t>
+      </w:r>
+    </w:p>
+    <w:p>
+      <w:pPr>
+        <w:pStyle w:val="ListParagraph"/>
+        <w:numPr>
+          <w:ilvl w:val="0"/>
+          <w:numId w:val="1"/>
+        </w:numPr>
+        <w:spacing w:after="60"/>
+        <w:rPr>
+          <w:sz w:val="22"/>
+          <w:szCs w:val="22"/>
+        </w:rPr>
+      </w:pPr>
+      <w:r>
+        <w:t xml:space="preserve">Cart supports multiple events and quantities</w:t>
+      </w:r>
+    </w:p>
+    <w:p>
+      <w:pPr>
+        <w:pStyle w:val="ListParagraph"/>
+        <w:numPr>
+          <w:ilvl w:val="0"/>
+          <w:numId w:val="1"/>
+        </w:numPr>
+        <w:spacing w:after="60"/>
+        <w:rPr>
+          <w:sz w:val="22"/>
+          <w:szCs w:val="22"/>
+        </w:rPr>
+      </w:pPr>
+      <w:r>
+        <w:t xml:space="preserve">Checkout requires authentication (unauthenticated users prompted to sign in)</w:t>
+      </w:r>
+    </w:p>
+    <w:p>
+      <w:pPr>
+        <w:pStyle w:val="ListParagraph"/>
+        <w:numPr>
+          <w:ilvl w:val="0"/>
+          <w:numId w:val="1"/>
+        </w:numPr>
+        <w:spacing w:after="60"/>
+        <w:rPr>
+          <w:sz w:val="22"/>
+          <w:szCs w:val="22"/>
+        </w:rPr>
+      </w:pPr>
+      <w:r>
+        <w:t xml:space="preserve">Ticket holder names are collected per ticket before payment</w:t>
+      </w:r>
+    </w:p>
+    <w:p>
+      <w:pPr>
+        <w:pStyle w:val="ListParagraph"/>
+        <w:numPr>
+          <w:ilvl w:val="0"/>
+          <w:numId w:val="1"/>
+        </w:numPr>
+        <w:spacing w:after="60"/>
+        <w:rPr>
+          <w:sz w:val="22"/>
+          <w:szCs w:val="22"/>
+        </w:rPr>
+      </w:pPr>
+      <w:r>
+        <w:t xml:space="preserve">Payment is processed via Stripe</w:t>
+      </w:r>
+    </w:p>
+    <w:p>
+      <w:pPr>
+        <w:pStyle w:val="ListParagraph"/>
+        <w:numPr>
+          <w:ilvl w:val="0"/>
+          <w:numId w:val="1"/>
+        </w:numPr>
+        <w:spacing w:after="60"/>
+        <w:rPr>
+          <w:sz w:val="22"/>
+          <w:szCs w:val="22"/>
+        </w:rPr>
+      </w:pPr>
+      <w:r>
+        <w:t xml:space="preserve">On success, an order record is created in the database with individual ticket records</w:t>
+      </w:r>
+    </w:p>
+    <w:p>
+      <w:pPr>
+        <w:pStyle w:val="ListParagraph"/>
+        <w:numPr>
+          <w:ilvl w:val="0"/>
+          <w:numId w:val="1"/>
+        </w:numPr>
+        <w:spacing w:after="60"/>
+        <w:rPr>
+          <w:sz w:val="22"/>
+          <w:szCs w:val="22"/>
+        </w:rPr>
+      </w:pPr>
+      <w:r>
+        <w:t xml:space="preserve">A confirmation screen is shown with a link to the user's orders</w:t>
+      </w:r>
+    </w:p>
+    <w:p>
+      <w:pPr>
+        <w:pStyle w:val="Heading2"/>
+        <w:spacing w:after="120" w:before="300"/>
+        <w:rPr>
+          <w:color w:val="5B21B6"/>
+        </w:rPr>
+      </w:pPr>
+      <w:r>
+        <w:t xml:space="preserve">Bilingual Content</w:t>
+      </w:r>
+    </w:p>
+    <w:p>
+      <w:pPr>
+        <w:pStyle w:val="ListParagraph"/>
+        <w:numPr>
+          <w:ilvl w:val="0"/>
+          <w:numId w:val="1"/>
+        </w:numPr>
+        <w:spacing w:after="60"/>
+        <w:rPr>
+          <w:sz w:val="22"/>
+          <w:szCs w:val="22"/>
+        </w:rPr>
+      </w:pPr>
+      <w:r>
+        <w:t xml:space="preserve">A LanguageProvider component wraps the entire application</w:t>
+      </w:r>
+    </w:p>
+    <w:p>
+      <w:pPr>
+        <w:pStyle w:val="ListParagraph"/>
+        <w:numPr>
+          <w:ilvl w:val="0"/>
+          <w:numId w:val="1"/>
+        </w:numPr>
+        <w:spacing w:after="60"/>
+        <w:rPr>
+          <w:sz w:val="22"/>
+          <w:szCs w:val="22"/>
+        </w:rPr>
+      </w:pPr>
+      <w:r>
+        <w:t xml:space="preserve">Language preference (en / cy) is persisted to localStorage</w:t>
+      </w:r>
+    </w:p>
+    <w:p>
+      <w:pPr>
+        <w:pStyle w:val="ListParagraph"/>
+        <w:numPr>
+          <w:ilvl w:val="0"/>
+          <w:numId w:val="1"/>
+        </w:numPr>
+        <w:spacing w:after="60"/>
+        <w:rPr>
+          <w:sz w:val="22"/>
+          <w:szCs w:val="22"/>
+        </w:rPr>
+      </w:pPr>
+      <w:r>
+        <w:t xml:space="preserve">All user-facing text has an English and Welsh version</w:t>
+      </w:r>
+    </w:p>
+    <w:p>
+      <w:pPr>
+        <w:pStyle w:val="ListParagraph"/>
+        <w:numPr>
+          <w:ilvl w:val="0"/>
+          <w:numId w:val="1"/>
+        </w:numPr>
+        <w:spacing w:after="60"/>
+        <w:rPr>
+          <w:sz w:val="22"/>
+          <w:szCs w:val="22"/>
+        </w:rPr>
+      </w:pPr>
+      <w:r>
+        <w:t xml:space="preserve">Event images also have bilingual variants (imgUrl / imgUrlWel) stored per event</w:t>
+      </w:r>
+    </w:p>
+    <w:p>
+      <w:pPr>
+        <w:pStyle w:val="ListParagraph"/>
+        <w:numPr>
+          <w:ilvl w:val="0"/>
+          <w:numId w:val="1"/>
+        </w:numPr>
+        <w:spacing w:after="60"/>
+        <w:rPr>
+          <w:sz w:val="22"/>
+          <w:szCs w:val="22"/>
+        </w:rPr>
+      </w:pPr>
+      <w:r>
+        <w:t xml:space="preserve">Admin users upload separate English and Welsh event images</w:t>
+      </w:r>
+    </w:p>
+    <w:p>
+      <w:pPr>
+        <w:pStyle w:val="Heading2"/>
+        <w:spacing w:after="120" w:before="300"/>
+        <w:rPr>
+          <w:color w:val="5B21B6"/>
+        </w:rPr>
+      </w:pPr>
+      <w:r>
+        <w:t xml:space="preserve">Event Management</w:t>
+      </w:r>
+    </w:p>
+    <w:p>
+      <w:pPr>
+        <w:pStyle w:val="ListParagraph"/>
+        <w:numPr>
+          <w:ilvl w:val="0"/>
+          <w:numId w:val="1"/>
+        </w:numPr>
+        <w:spacing w:after="60"/>
+        <w:rPr>
+          <w:sz w:val="22"/>
+          <w:szCs w:val="22"/>
+        </w:rPr>
+      </w:pPr>
+      <w:r>
+        <w:t xml:space="preserve">Admins create events with name, description, price, capacity, start/end dates, location, and map link</w:t>
+      </w:r>
+    </w:p>
+    <w:p>
+      <w:pPr>
+        <w:pStyle w:val="ListParagraph"/>
+        <w:numPr>
+          <w:ilvl w:val="0"/>
+          <w:numId w:val="1"/>
+        </w:numPr>
+        <w:spacing w:after="60"/>
+        <w:rPr>
+          <w:sz w:val="22"/>
+          <w:szCs w:val="22"/>
+        </w:rPr>
+      </w:pPr>
+      <w:r>
+        <w:t xml:space="preserve">Events display availability badges based on remaining capacity</w:t>
+      </w:r>
+    </w:p>
+    <w:p>
+      <w:pPr>
+        <w:pStyle w:val="ListParagraph"/>
+        <w:numPr>
+          <w:ilvl w:val="0"/>
+          <w:numId w:val="1"/>
+        </w:numPr>
+        <w:spacing w:after="60"/>
+        <w:rPr>
+          <w:sz w:val="22"/>
+          <w:szCs w:val="22"/>
+        </w:rPr>
+      </w:pPr>
+      <w:r>
+        <w:t xml:space="preserve">Events past their end date are automatically marked as Expired</w:t>
+      </w:r>
+    </w:p>
+    <w:p>
+      <w:pPr>
+        <w:pStyle w:val="ListParagraph"/>
+        <w:numPr>
+          <w:ilvl w:val="0"/>
+          <w:numId w:val="1"/>
+        </w:numPr>
+        <w:spacing w:after="60"/>
+        <w:rPr>
+          <w:sz w:val="22"/>
+          <w:szCs w:val="22"/>
+        </w:rPr>
+      </w:pPr>
+      <w:r>
+        <w:t xml:space="preserve">Event images are served in the user's selected language</w:t>
+      </w:r>
+    </w:p>
+    <w:p>
+      <w:pPr>
+        <w:pStyle w:val="Heading2"/>
+        <w:spacing w:after="120" w:before="300"/>
+        <w:rPr>
+          <w:color w:val="5B21B6"/>
+        </w:rPr>
+      </w:pPr>
+      <w:r>
+        <w:t xml:space="preserve">Fundraising Data Management</w:t>
+      </w:r>
+    </w:p>
+    <w:p>
+      <w:pPr>
+        <w:pStyle w:val="ListParagraph"/>
+        <w:numPr>
+          <w:ilvl w:val="0"/>
+          <w:numId w:val="1"/>
+        </w:numPr>
+        <w:spacing w:after="60"/>
+        <w:rPr>
+          <w:sz w:val="22"/>
+          <w:szCs w:val="22"/>
+        </w:rPr>
+      </w:pPr>
+      <w:r>
+        <w:t xml:space="preserve">Admins enter income and expenditure records via the Fundraising Data admin page</w:t>
+      </w:r>
+    </w:p>
+    <w:p>
+      <w:pPr>
+        <w:pStyle w:val="ListParagraph"/>
+        <w:numPr>
+          <w:ilvl w:val="0"/>
+          <w:numId w:val="1"/>
+        </w:numPr>
+        <w:spacing w:after="60"/>
+        <w:rPr>
+          <w:sz w:val="22"/>
+          <w:szCs w:val="22"/>
+        </w:rPr>
+      </w:pPr>
+      <w:r>
+        <w:t xml:space="preserve">Each record has a label (event/item name), type (income | expenditure), year, and amount</w:t>
+      </w:r>
+    </w:p>
+    <w:p>
+      <w:pPr>
+        <w:pStyle w:val="ListParagraph"/>
+        <w:numPr>
+          <w:ilvl w:val="0"/>
+          <w:numId w:val="1"/>
+        </w:numPr>
+        <w:spacing w:after="60"/>
+        <w:rPr>
+          <w:sz w:val="22"/>
+          <w:szCs w:val="22"/>
+        </w:rPr>
+      </w:pPr>
+      <w:r>
+        <w:t xml:space="preserve">Amounts are stored in pence (integer) and displayed as pounds in the UI</w:t>
+      </w:r>
+    </w:p>
+    <w:p>
+      <w:pPr>
+        <w:pStyle w:val="ListParagraph"/>
+        <w:numPr>
+          <w:ilvl w:val="0"/>
+          <w:numId w:val="1"/>
+        </w:numPr>
+        <w:spacing w:after="60"/>
+        <w:rPr>
+          <w:sz w:val="22"/>
+          <w:szCs w:val="22"/>
+        </w:rPr>
+      </w:pPr>
+      <w:r>
+        <w:t xml:space="preserve">Data powers the grouped bar chart on the public Fundraising page</w:t>
+      </w:r>
+    </w:p>
+    <w:p>
+      <w:pPr>
+        <w:pStyle w:val="ListParagraph"/>
+        <w:numPr>
+          <w:ilvl w:val="0"/>
+          <w:numId w:val="1"/>
+        </w:numPr>
+        <w:spacing w:after="60"/>
+        <w:rPr>
+          <w:sz w:val="22"/>
+          <w:szCs w:val="22"/>
+        </w:rPr>
+      </w:pPr>
+      <w:r>
+        <w:t xml:space="preserve">Chart shows income (purple) vs expenditure (amber) per year using Recharts</w:t>
+      </w:r>
+    </w:p>
+    <w:p>
+      <w:pPr>
+        <w:pStyle w:val="ListParagraph"/>
+        <w:numPr>
+          <w:ilvl w:val="0"/>
+          <w:numId w:val="1"/>
+        </w:numPr>
+        <w:spacing w:after="60"/>
+        <w:rPr>
+          <w:sz w:val="22"/>
+          <w:szCs w:val="22"/>
+        </w:rPr>
+      </w:pPr>
+      <w:r>
+        <w:t xml:space="preserve">Year filter tabs on both the admin and public pages for focused views</w:t>
+      </w:r>
+    </w:p>
+    <w:p>
+      <w:pPr>
+        <w:pStyle w:val="Heading2"/>
+        <w:spacing w:after="120" w:before="300"/>
+        <w:rPr>
+          <w:color w:val="5B21B6"/>
+        </w:rPr>
+      </w:pPr>
+      <w:r>
+        <w:t xml:space="preserve">Data Layer</w:t>
       </w:r>
     </w:p>
     <w:p>
@@ -8869,7 +9285,7 @@
           <w:sz w:val="22"/>
           <w:szCs w:val="22"/>
         </w:rPr>
-        <w:t xml:space="preserve">Quick reference for key terms used consistently across the application:</w:t>
+        <w:t xml:space="preserve">Five database tables:</w:t>
       </w:r>
     </w:p>
     <w:tbl>
@@ -8907,7 +9323,7 @@
                 <w:sz w:val="20"/>
                 <w:szCs w:val="20"/>
               </w:rPr>
-              <w:t xml:space="preserve">English</w:t>
+              <w:t xml:space="preserve">Table</w:t>
             </w:r>
           </w:p>
         </w:tc>
@@ -8929,7 +9345,7 @@
                 <w:sz w:val="20"/>
                 <w:szCs w:val="20"/>
               </w:rPr>
-              <w:t xml:space="preserve">Welsh (Cymraeg)</w:t>
+              <w:t xml:space="preserve">Key columns</w:t>
             </w:r>
           </w:p>
         </w:tc>
@@ -8953,29 +9369,29 @@
                 <w:sz w:val="20"/>
                 <w:szCs w:val="20"/>
               </w:rPr>
-              <w:t xml:space="preserve">PTA (Parent Teacher Association)</w:t>
-            </w:r>
-          </w:p>
-        </w:tc>
-        <w:tc>
-          <w:tcPr>
-            <w:shd/>
-            <w:tcMar>
-              <w:top w:type="dxa" w:w="80"/>
-              <w:left w:type="dxa" w:w="120"/>
-              <w:bottom w:type="dxa" w:w="80"/>
-              <w:right w:type="dxa" w:w="120"/>
-            </w:tcMar>
-          </w:tcPr>
-          <w:p>
-            <w:r>
-              <w:rPr>
-                <w:b w:val="false"/>
-                <w:bCs w:val="false"/>
-                <w:sz w:val="20"/>
-                <w:szCs w:val="20"/>
-              </w:rPr>
-              <w:t xml:space="preserve">CRhA (Cymdeithas Rhieni ac Athrawon)</w:t>
+              <w:t xml:space="preserve">users</w:t>
+            </w:r>
+          </w:p>
+        </w:tc>
+        <w:tc>
+          <w:tcPr>
+            <w:shd/>
+            <w:tcMar>
+              <w:top w:type="dxa" w:w="80"/>
+              <w:left w:type="dxa" w:w="120"/>
+              <w:bottom w:type="dxa" w:w="80"/>
+              <w:right w:type="dxa" w:w="120"/>
+            </w:tcMar>
+          </w:tcPr>
+          <w:p>
+            <w:r>
+              <w:rPr>
+                <w:b w:val="false"/>
+                <w:bCs w:val="false"/>
+                <w:sz w:val="20"/>
+                <w:szCs w:val="20"/>
+              </w:rPr>
+              <w:t xml:space="preserve">id, clerkId, name, email, role</w:t>
             </w:r>
           </w:p>
         </w:tc>
@@ -8999,29 +9415,29 @@
                 <w:sz w:val="20"/>
                 <w:szCs w:val="20"/>
               </w:rPr>
-              <w:t xml:space="preserve">Events</w:t>
-            </w:r>
-          </w:p>
-        </w:tc>
-        <w:tc>
-          <w:tcPr>
-            <w:shd/>
-            <w:tcMar>
-              <w:top w:type="dxa" w:w="80"/>
-              <w:left w:type="dxa" w:w="120"/>
-              <w:bottom w:type="dxa" w:w="80"/>
-              <w:right w:type="dxa" w:w="120"/>
-            </w:tcMar>
-          </w:tcPr>
-          <w:p>
-            <w:r>
-              <w:rPr>
-                <w:b w:val="false"/>
-                <w:bCs w:val="false"/>
-                <w:sz w:val="20"/>
-                <w:szCs w:val="20"/>
-              </w:rPr>
-              <w:t xml:space="preserve">Digwyddiadau</w:t>
+              <w:t xml:space="preserve">events</w:t>
+            </w:r>
+          </w:p>
+        </w:tc>
+        <w:tc>
+          <w:tcPr>
+            <w:shd/>
+            <w:tcMar>
+              <w:top w:type="dxa" w:w="80"/>
+              <w:left w:type="dxa" w:w="120"/>
+              <w:bottom w:type="dxa" w:w="80"/>
+              <w:right w:type="dxa" w:w="120"/>
+            </w:tcMar>
+          </w:tcPr>
+          <w:p>
+            <w:r>
+              <w:rPr>
+                <w:b w:val="false"/>
+                <w:bCs w:val="false"/>
+                <w:sz w:val="20"/>
+                <w:szCs w:val="20"/>
+              </w:rPr>
+              <w:t xml:space="preserve">id, name, description, price, capacity, startDate, endDate, location, mapsLink, imgUrl, imgUrlWel</w:t>
             </w:r>
           </w:p>
         </w:tc>
@@ -9045,29 +9461,29 @@
                 <w:sz w:val="20"/>
                 <w:szCs w:val="20"/>
               </w:rPr>
-              <w:t xml:space="preserve">Fundraising</w:t>
-            </w:r>
-          </w:p>
-        </w:tc>
-        <w:tc>
-          <w:tcPr>
-            <w:shd/>
-            <w:tcMar>
-              <w:top w:type="dxa" w:w="80"/>
-              <w:left w:type="dxa" w:w="120"/>
-              <w:bottom w:type="dxa" w:w="80"/>
-              <w:right w:type="dxa" w:w="120"/>
-            </w:tcMar>
-          </w:tcPr>
-          <w:p>
-            <w:r>
-              <w:rPr>
-                <w:b w:val="false"/>
-                <w:bCs w:val="false"/>
-                <w:sz w:val="20"/>
-                <w:szCs w:val="20"/>
-              </w:rPr>
-              <w:t xml:space="preserve">Codi Arian</w:t>
+              <w:t xml:space="preserve">orders</w:t>
+            </w:r>
+          </w:p>
+        </w:tc>
+        <w:tc>
+          <w:tcPr>
+            <w:shd/>
+            <w:tcMar>
+              <w:top w:type="dxa" w:w="80"/>
+              <w:left w:type="dxa" w:w="120"/>
+              <w:bottom w:type="dxa" w:w="80"/>
+              <w:right w:type="dxa" w:w="120"/>
+            </w:tcMar>
+          </w:tcPr>
+          <w:p>
+            <w:r>
+              <w:rPr>
+                <w:b w:val="false"/>
+                <w:bCs w:val="false"/>
+                <w:sz w:val="20"/>
+                <w:szCs w:val="20"/>
+              </w:rPr>
+              <w:t xml:space="preserve">id, userId, eventId, orderRef, status, totalAmount, createdAt</w:t>
             </w:r>
           </w:p>
         </w:tc>
@@ -9091,29 +9507,29 @@
                 <w:sz w:val="20"/>
                 <w:szCs w:val="20"/>
               </w:rPr>
-              <w:t xml:space="preserve">About Us</w:t>
-            </w:r>
-          </w:p>
-        </w:tc>
-        <w:tc>
-          <w:tcPr>
-            <w:shd/>
-            <w:tcMar>
-              <w:top w:type="dxa" w:w="80"/>
-              <w:left w:type="dxa" w:w="120"/>
-              <w:bottom w:type="dxa" w:w="80"/>
-              <w:right w:type="dxa" w:w="120"/>
-            </w:tcMar>
-          </w:tcPr>
-          <w:p>
-            <w:r>
-              <w:rPr>
-                <w:b w:val="false"/>
-                <w:bCs w:val="false"/>
-                <w:sz w:val="20"/>
-                <w:szCs w:val="20"/>
-              </w:rPr>
-              <w:t xml:space="preserve">Amdanom ni</w:t>
+              <w:t xml:space="preserve">tickets</w:t>
+            </w:r>
+          </w:p>
+        </w:tc>
+        <w:tc>
+          <w:tcPr>
+            <w:shd/>
+            <w:tcMar>
+              <w:top w:type="dxa" w:w="80"/>
+              <w:left w:type="dxa" w:w="120"/>
+              <w:bottom w:type="dxa" w:w="80"/>
+              <w:right w:type="dxa" w:w="120"/>
+            </w:tcMar>
+          </w:tcPr>
+          <w:p>
+            <w:r>
+              <w:rPr>
+                <w:b w:val="false"/>
+                <w:bCs w:val="false"/>
+                <w:sz w:val="20"/>
+                <w:szCs w:val="20"/>
+              </w:rPr>
+              <w:t xml:space="preserve">id, orderId, eventId, ticketHolderName</w:t>
             </w:r>
           </w:p>
         </w:tc>
@@ -9137,29 +9553,129 @@
                 <w:sz w:val="20"/>
                 <w:szCs w:val="20"/>
               </w:rPr>
-              <w:t xml:space="preserve">Contact</w:t>
-            </w:r>
-          </w:p>
-        </w:tc>
-        <w:tc>
-          <w:tcPr>
-            <w:shd/>
-            <w:tcMar>
-              <w:top w:type="dxa" w:w="80"/>
-              <w:left w:type="dxa" w:w="120"/>
-              <w:bottom w:type="dxa" w:w="80"/>
-              <w:right w:type="dxa" w:w="120"/>
-            </w:tcMar>
-          </w:tcPr>
-          <w:p>
-            <w:r>
-              <w:rPr>
-                <w:b w:val="false"/>
-                <w:bCs w:val="false"/>
-                <w:sz w:val="20"/>
-                <w:szCs w:val="20"/>
-              </w:rPr>
-              <w:t xml:space="preserve">Cysylltu</w:t>
+              <w:t xml:space="preserve">fundraising</w:t>
+            </w:r>
+          </w:p>
+        </w:tc>
+        <w:tc>
+          <w:tcPr>
+            <w:shd/>
+            <w:tcMar>
+              <w:top w:type="dxa" w:w="80"/>
+              <w:left w:type="dxa" w:w="120"/>
+              <w:bottom w:type="dxa" w:w="80"/>
+              <w:right w:type="dxa" w:w="120"/>
+            </w:tcMar>
+          </w:tcPr>
+          <w:p>
+            <w:r>
+              <w:rPr>
+                <w:b w:val="false"/>
+                <w:bCs w:val="false"/>
+                <w:sz w:val="20"/>
+                <w:szCs w:val="20"/>
+              </w:rPr>
+              <w:t xml:space="preserve">id, label, type ('income'|'expenditure'), year, amount (pence), createdAt</w:t>
+            </w:r>
+          </w:p>
+        </w:tc>
+      </w:tr>
+    </w:tbl>
+    <w:p>
+      <w:pPr>
+        <w:spacing w:after="100"/>
+      </w:pPr>
+    </w:p>
+    <w:p>
+      <w:r>
+        <w:br w:type="page"/>
+      </w:r>
+    </w:p>
+    <w:p>
+      <w:pPr>
+        <w:pStyle w:val="Heading1"/>
+        <w:shd w:fill="EDE9FE" w:val="clear"/>
+        <w:spacing w:after="200" w:before="400"/>
+        <w:rPr>
+          <w:b/>
+          <w:bCs/>
+          <w:color w:val="5B21B6"/>
+        </w:rPr>
+      </w:pPr>
+      <w:r>
+        <w:t xml:space="preserve">9. Bilingual Content Reference</w:t>
+      </w:r>
+    </w:p>
+    <w:p>
+      <w:pPr>
+        <w:spacing w:after="100"/>
+      </w:pPr>
+      <w:r>
+        <w:rPr>
+          <w:sz w:val="22"/>
+          <w:szCs w:val="22"/>
+        </w:rPr>
+        <w:t xml:space="preserve">Quick reference for key terms used consistently across the application:</w:t>
+      </w:r>
+    </w:p>
+    <w:tbl>
+      <w:tblPr>
+        <w:tblW w:type="pct" w:w="100%"/>
+        <w:tblBorders>
+          <w:top w:val="single" w:color="auto" w:sz="4"/>
+          <w:left w:val="single" w:color="auto" w:sz="4"/>
+          <w:bottom w:val="single" w:color="auto" w:sz="4"/>
+          <w:right w:val="single" w:color="auto" w:sz="4"/>
+          <w:insideH w:val="single" w:color="auto" w:sz="4"/>
+          <w:insideV w:val="single" w:color="auto" w:sz="4"/>
+        </w:tblBorders>
+      </w:tblPr>
+      <w:tblGrid>
+        <w:gridCol w:w="100"/>
+        <w:gridCol w:w="100"/>
+      </w:tblGrid>
+      <w:tr>
+        <w:tc>
+          <w:tcPr>
+            <w:shd w:fill="5B21B6" w:val="clear"/>
+            <w:tcMar>
+              <w:top w:type="dxa" w:w="80"/>
+              <w:left w:type="dxa" w:w="120"/>
+              <w:bottom w:type="dxa" w:w="80"/>
+              <w:right w:type="dxa" w:w="120"/>
+            </w:tcMar>
+          </w:tcPr>
+          <w:p>
+            <w:r>
+              <w:rPr>
+                <w:b/>
+                <w:bCs/>
+                <w:sz w:val="20"/>
+                <w:szCs w:val="20"/>
+              </w:rPr>
+              <w:t xml:space="preserve">English</w:t>
+            </w:r>
+          </w:p>
+        </w:tc>
+        <w:tc>
+          <w:tcPr>
+            <w:shd w:fill="5B21B6" w:val="clear"/>
+            <w:tcMar>
+              <w:top w:type="dxa" w:w="80"/>
+              <w:left w:type="dxa" w:w="120"/>
+              <w:bottom w:type="dxa" w:w="80"/>
+              <w:right w:type="dxa" w:w="120"/>
+            </w:tcMar>
+          </w:tcPr>
+          <w:p>
+            <w:r>
+              <w:rPr>
+                <w:b/>
+                <w:bCs/>
+                <w:sz w:val="20"/>
+                <w:szCs w:val="20"/>
+              </w:rPr>
+              <w:t xml:space="preserve">Welsh (Cymraeg)</w:t>
             </w:r>
           </w:p>
         </w:tc>
@@ -9183,29 +9699,29 @@
                 <w:sz w:val="20"/>
                 <w:szCs w:val="20"/>
               </w:rPr>
-              <w:t xml:space="preserve">Community Achievements</w:t>
-            </w:r>
-          </w:p>
-        </w:tc>
-        <w:tc>
-          <w:tcPr>
-            <w:shd/>
-            <w:tcMar>
-              <w:top w:type="dxa" w:w="80"/>
-              <w:left w:type="dxa" w:w="120"/>
-              <w:bottom w:type="dxa" w:w="80"/>
-              <w:right w:type="dxa" w:w="120"/>
-            </w:tcMar>
-          </w:tcPr>
-          <w:p>
-            <w:r>
-              <w:rPr>
-                <w:b w:val="false"/>
-                <w:bCs w:val="false"/>
-                <w:sz w:val="20"/>
-                <w:szCs w:val="20"/>
-              </w:rPr>
-              <w:t xml:space="preserve">Cyflawniadau Cymunedol</w:t>
+              <w:t xml:space="preserve">PTA (Parent Teacher Association)</w:t>
+            </w:r>
+          </w:p>
+        </w:tc>
+        <w:tc>
+          <w:tcPr>
+            <w:shd/>
+            <w:tcMar>
+              <w:top w:type="dxa" w:w="80"/>
+              <w:left w:type="dxa" w:w="120"/>
+              <w:bottom w:type="dxa" w:w="80"/>
+              <w:right w:type="dxa" w:w="120"/>
+            </w:tcMar>
+          </w:tcPr>
+          <w:p>
+            <w:r>
+              <w:rPr>
+                <w:b w:val="false"/>
+                <w:bCs w:val="false"/>
+                <w:sz w:val="20"/>
+                <w:szCs w:val="20"/>
+              </w:rPr>
+              <w:t xml:space="preserve">CRhA (Cymdeithas Rhieni ac Athrawon)</w:t>
             </w:r>
           </w:p>
         </w:tc>
@@ -9229,29 +9745,29 @@
                 <w:sz w:val="20"/>
                 <w:szCs w:val="20"/>
               </w:rPr>
-              <w:t xml:space="preserve">Reports &amp; Documents</w:t>
-            </w:r>
-          </w:p>
-        </w:tc>
-        <w:tc>
-          <w:tcPr>
-            <w:shd/>
-            <w:tcMar>
-              <w:top w:type="dxa" w:w="80"/>
-              <w:left w:type="dxa" w:w="120"/>
-              <w:bottom w:type="dxa" w:w="80"/>
-              <w:right w:type="dxa" w:w="120"/>
-            </w:tcMar>
-          </w:tcPr>
-          <w:p>
-            <w:r>
-              <w:rPr>
-                <w:b w:val="false"/>
-                <w:bCs w:val="false"/>
-                <w:sz w:val="20"/>
-                <w:szCs w:val="20"/>
-              </w:rPr>
-              <w:t xml:space="preserve">Adroddiadau a Dogfennau</w:t>
+              <w:t xml:space="preserve">Events</w:t>
+            </w:r>
+          </w:p>
+        </w:tc>
+        <w:tc>
+          <w:tcPr>
+            <w:shd/>
+            <w:tcMar>
+              <w:top w:type="dxa" w:w="80"/>
+              <w:left w:type="dxa" w:w="120"/>
+              <w:bottom w:type="dxa" w:w="80"/>
+              <w:right w:type="dxa" w:w="120"/>
+            </w:tcMar>
+          </w:tcPr>
+          <w:p>
+            <w:r>
+              <w:rPr>
+                <w:b w:val="false"/>
+                <w:bCs w:val="false"/>
+                <w:sz w:val="20"/>
+                <w:szCs w:val="20"/>
+              </w:rPr>
+              <w:t xml:space="preserve">Digwyddiadau</w:t>
             </w:r>
           </w:p>
         </w:tc>
@@ -9275,29 +9791,29 @@
                 <w:sz w:val="20"/>
                 <w:szCs w:val="20"/>
               </w:rPr>
-              <w:t xml:space="preserve">Orders</w:t>
-            </w:r>
-          </w:p>
-        </w:tc>
-        <w:tc>
-          <w:tcPr>
-            <w:shd/>
-            <w:tcMar>
-              <w:top w:type="dxa" w:w="80"/>
-              <w:left w:type="dxa" w:w="120"/>
-              <w:bottom w:type="dxa" w:w="80"/>
-              <w:right w:type="dxa" w:w="120"/>
-            </w:tcMar>
-          </w:tcPr>
-          <w:p>
-            <w:r>
-              <w:rPr>
-                <w:b w:val="false"/>
-                <w:bCs w:val="false"/>
-                <w:sz w:val="20"/>
-                <w:szCs w:val="20"/>
-              </w:rPr>
-              <w:t xml:space="preserve">Archebion</w:t>
+              <w:t xml:space="preserve">Fundraising</w:t>
+            </w:r>
+          </w:p>
+        </w:tc>
+        <w:tc>
+          <w:tcPr>
+            <w:shd/>
+            <w:tcMar>
+              <w:top w:type="dxa" w:w="80"/>
+              <w:left w:type="dxa" w:w="120"/>
+              <w:bottom w:type="dxa" w:w="80"/>
+              <w:right w:type="dxa" w:w="120"/>
+            </w:tcMar>
+          </w:tcPr>
+          <w:p>
+            <w:r>
+              <w:rPr>
+                <w:b w:val="false"/>
+                <w:bCs w:val="false"/>
+                <w:sz w:val="20"/>
+                <w:szCs w:val="20"/>
+              </w:rPr>
+              <w:t xml:space="preserve">Codi Arian</w:t>
             </w:r>
           </w:p>
         </w:tc>
@@ -9321,6 +9837,236 @@
                 <w:sz w:val="20"/>
                 <w:szCs w:val="20"/>
               </w:rPr>
+              <w:t xml:space="preserve">About Us</w:t>
+            </w:r>
+          </w:p>
+        </w:tc>
+        <w:tc>
+          <w:tcPr>
+            <w:shd/>
+            <w:tcMar>
+              <w:top w:type="dxa" w:w="80"/>
+              <w:left w:type="dxa" w:w="120"/>
+              <w:bottom w:type="dxa" w:w="80"/>
+              <w:right w:type="dxa" w:w="120"/>
+            </w:tcMar>
+          </w:tcPr>
+          <w:p>
+            <w:r>
+              <w:rPr>
+                <w:b w:val="false"/>
+                <w:bCs w:val="false"/>
+                <w:sz w:val="20"/>
+                <w:szCs w:val="20"/>
+              </w:rPr>
+              <w:t xml:space="preserve">Amdanom ni</w:t>
+            </w:r>
+          </w:p>
+        </w:tc>
+      </w:tr>
+      <w:tr>
+        <w:tc>
+          <w:tcPr>
+            <w:shd/>
+            <w:tcMar>
+              <w:top w:type="dxa" w:w="80"/>
+              <w:left w:type="dxa" w:w="120"/>
+              <w:bottom w:type="dxa" w:w="80"/>
+              <w:right w:type="dxa" w:w="120"/>
+            </w:tcMar>
+          </w:tcPr>
+          <w:p>
+            <w:r>
+              <w:rPr>
+                <w:b w:val="false"/>
+                <w:bCs w:val="false"/>
+                <w:sz w:val="20"/>
+                <w:szCs w:val="20"/>
+              </w:rPr>
+              <w:t xml:space="preserve">Contact</w:t>
+            </w:r>
+          </w:p>
+        </w:tc>
+        <w:tc>
+          <w:tcPr>
+            <w:shd/>
+            <w:tcMar>
+              <w:top w:type="dxa" w:w="80"/>
+              <w:left w:type="dxa" w:w="120"/>
+              <w:bottom w:type="dxa" w:w="80"/>
+              <w:right w:type="dxa" w:w="120"/>
+            </w:tcMar>
+          </w:tcPr>
+          <w:p>
+            <w:r>
+              <w:rPr>
+                <w:b w:val="false"/>
+                <w:bCs w:val="false"/>
+                <w:sz w:val="20"/>
+                <w:szCs w:val="20"/>
+              </w:rPr>
+              <w:t xml:space="preserve">Cysylltu</w:t>
+            </w:r>
+          </w:p>
+        </w:tc>
+      </w:tr>
+      <w:tr>
+        <w:tc>
+          <w:tcPr>
+            <w:shd/>
+            <w:tcMar>
+              <w:top w:type="dxa" w:w="80"/>
+              <w:left w:type="dxa" w:w="120"/>
+              <w:bottom w:type="dxa" w:w="80"/>
+              <w:right w:type="dxa" w:w="120"/>
+            </w:tcMar>
+          </w:tcPr>
+          <w:p>
+            <w:r>
+              <w:rPr>
+                <w:b w:val="false"/>
+                <w:bCs w:val="false"/>
+                <w:sz w:val="20"/>
+                <w:szCs w:val="20"/>
+              </w:rPr>
+              <w:t xml:space="preserve">Community Achievements</w:t>
+            </w:r>
+          </w:p>
+        </w:tc>
+        <w:tc>
+          <w:tcPr>
+            <w:shd/>
+            <w:tcMar>
+              <w:top w:type="dxa" w:w="80"/>
+              <w:left w:type="dxa" w:w="120"/>
+              <w:bottom w:type="dxa" w:w="80"/>
+              <w:right w:type="dxa" w:w="120"/>
+            </w:tcMar>
+          </w:tcPr>
+          <w:p>
+            <w:r>
+              <w:rPr>
+                <w:b w:val="false"/>
+                <w:bCs w:val="false"/>
+                <w:sz w:val="20"/>
+                <w:szCs w:val="20"/>
+              </w:rPr>
+              <w:t xml:space="preserve">Cyflawniadau Cymunedol</w:t>
+            </w:r>
+          </w:p>
+        </w:tc>
+      </w:tr>
+      <w:tr>
+        <w:tc>
+          <w:tcPr>
+            <w:shd/>
+            <w:tcMar>
+              <w:top w:type="dxa" w:w="80"/>
+              <w:left w:type="dxa" w:w="120"/>
+              <w:bottom w:type="dxa" w:w="80"/>
+              <w:right w:type="dxa" w:w="120"/>
+            </w:tcMar>
+          </w:tcPr>
+          <w:p>
+            <w:r>
+              <w:rPr>
+                <w:b w:val="false"/>
+                <w:bCs w:val="false"/>
+                <w:sz w:val="20"/>
+                <w:szCs w:val="20"/>
+              </w:rPr>
+              <w:t xml:space="preserve">Reports &amp; Documents</w:t>
+            </w:r>
+          </w:p>
+        </w:tc>
+        <w:tc>
+          <w:tcPr>
+            <w:shd/>
+            <w:tcMar>
+              <w:top w:type="dxa" w:w="80"/>
+              <w:left w:type="dxa" w:w="120"/>
+              <w:bottom w:type="dxa" w:w="80"/>
+              <w:right w:type="dxa" w:w="120"/>
+            </w:tcMar>
+          </w:tcPr>
+          <w:p>
+            <w:r>
+              <w:rPr>
+                <w:b w:val="false"/>
+                <w:bCs w:val="false"/>
+                <w:sz w:val="20"/>
+                <w:szCs w:val="20"/>
+              </w:rPr>
+              <w:t xml:space="preserve">Adroddiadau a Dogfennau</w:t>
+            </w:r>
+          </w:p>
+        </w:tc>
+      </w:tr>
+      <w:tr>
+        <w:tc>
+          <w:tcPr>
+            <w:shd/>
+            <w:tcMar>
+              <w:top w:type="dxa" w:w="80"/>
+              <w:left w:type="dxa" w:w="120"/>
+              <w:bottom w:type="dxa" w:w="80"/>
+              <w:right w:type="dxa" w:w="120"/>
+            </w:tcMar>
+          </w:tcPr>
+          <w:p>
+            <w:r>
+              <w:rPr>
+                <w:b w:val="false"/>
+                <w:bCs w:val="false"/>
+                <w:sz w:val="20"/>
+                <w:szCs w:val="20"/>
+              </w:rPr>
+              <w:t xml:space="preserve">Orders</w:t>
+            </w:r>
+          </w:p>
+        </w:tc>
+        <w:tc>
+          <w:tcPr>
+            <w:shd/>
+            <w:tcMar>
+              <w:top w:type="dxa" w:w="80"/>
+              <w:left w:type="dxa" w:w="120"/>
+              <w:bottom w:type="dxa" w:w="80"/>
+              <w:right w:type="dxa" w:w="120"/>
+            </w:tcMar>
+          </w:tcPr>
+          <w:p>
+            <w:r>
+              <w:rPr>
+                <w:b w:val="false"/>
+                <w:bCs w:val="false"/>
+                <w:sz w:val="20"/>
+                <w:szCs w:val="20"/>
+              </w:rPr>
+              <w:t xml:space="preserve">Archebion</w:t>
+            </w:r>
+          </w:p>
+        </w:tc>
+      </w:tr>
+      <w:tr>
+        <w:tc>
+          <w:tcPr>
+            <w:shd/>
+            <w:tcMar>
+              <w:top w:type="dxa" w:w="80"/>
+              <w:left w:type="dxa" w:w="120"/>
+              <w:bottom w:type="dxa" w:w="80"/>
+              <w:right w:type="dxa" w:w="120"/>
+            </w:tcMar>
+          </w:tcPr>
+          <w:p>
+            <w:r>
+              <w:rPr>
+                <w:b w:val="false"/>
+                <w:bCs w:val="false"/>
+                <w:sz w:val="20"/>
+                <w:szCs w:val="20"/>
+              </w:rPr>
               <w:t xml:space="preserve">Analytics</w:t>
             </w:r>
           </w:p>
@@ -9344,6 +10090,236 @@
                 <w:szCs w:val="20"/>
               </w:rPr>
               <w:t xml:space="preserve">Dadansoddeg</w:t>
+            </w:r>
+          </w:p>
+        </w:tc>
+      </w:tr>
+      <w:tr>
+        <w:tc>
+          <w:tcPr>
+            <w:shd/>
+            <w:tcMar>
+              <w:top w:type="dxa" w:w="80"/>
+              <w:left w:type="dxa" w:w="120"/>
+              <w:bottom w:type="dxa" w:w="80"/>
+              <w:right w:type="dxa" w:w="120"/>
+            </w:tcMar>
+          </w:tcPr>
+          <w:p>
+            <w:r>
+              <w:rPr>
+                <w:b w:val="false"/>
+                <w:bCs w:val="false"/>
+                <w:sz w:val="20"/>
+                <w:szCs w:val="20"/>
+              </w:rPr>
+              <w:t xml:space="preserve">Financial Breakdown</w:t>
+            </w:r>
+          </w:p>
+        </w:tc>
+        <w:tc>
+          <w:tcPr>
+            <w:shd/>
+            <w:tcMar>
+              <w:top w:type="dxa" w:w="80"/>
+              <w:left w:type="dxa" w:w="120"/>
+              <w:bottom w:type="dxa" w:w="80"/>
+              <w:right w:type="dxa" w:w="120"/>
+            </w:tcMar>
+          </w:tcPr>
+          <w:p>
+            <w:r>
+              <w:rPr>
+                <w:b w:val="false"/>
+                <w:bCs w:val="false"/>
+                <w:sz w:val="20"/>
+                <w:szCs w:val="20"/>
+              </w:rPr>
+              <w:t xml:space="preserve">Dadansoddiad Ariannol</w:t>
+            </w:r>
+          </w:p>
+        </w:tc>
+      </w:tr>
+      <w:tr>
+        <w:tc>
+          <w:tcPr>
+            <w:shd/>
+            <w:tcMar>
+              <w:top w:type="dxa" w:w="80"/>
+              <w:left w:type="dxa" w:w="120"/>
+              <w:bottom w:type="dxa" w:w="80"/>
+              <w:right w:type="dxa" w:w="120"/>
+            </w:tcMar>
+          </w:tcPr>
+          <w:p>
+            <w:r>
+              <w:rPr>
+                <w:b w:val="false"/>
+                <w:bCs w:val="false"/>
+                <w:sz w:val="20"/>
+                <w:szCs w:val="20"/>
+              </w:rPr>
+              <w:t xml:space="preserve">Income</w:t>
+            </w:r>
+          </w:p>
+        </w:tc>
+        <w:tc>
+          <w:tcPr>
+            <w:shd/>
+            <w:tcMar>
+              <w:top w:type="dxa" w:w="80"/>
+              <w:left w:type="dxa" w:w="120"/>
+              <w:bottom w:type="dxa" w:w="80"/>
+              <w:right w:type="dxa" w:w="120"/>
+            </w:tcMar>
+          </w:tcPr>
+          <w:p>
+            <w:r>
+              <w:rPr>
+                <w:b w:val="false"/>
+                <w:bCs w:val="false"/>
+                <w:sz w:val="20"/>
+                <w:szCs w:val="20"/>
+              </w:rPr>
+              <w:t xml:space="preserve">Incwm</w:t>
+            </w:r>
+          </w:p>
+        </w:tc>
+      </w:tr>
+      <w:tr>
+        <w:tc>
+          <w:tcPr>
+            <w:shd/>
+            <w:tcMar>
+              <w:top w:type="dxa" w:w="80"/>
+              <w:left w:type="dxa" w:w="120"/>
+              <w:bottom w:type="dxa" w:w="80"/>
+              <w:right w:type="dxa" w:w="120"/>
+            </w:tcMar>
+          </w:tcPr>
+          <w:p>
+            <w:r>
+              <w:rPr>
+                <w:b w:val="false"/>
+                <w:bCs w:val="false"/>
+                <w:sz w:val="20"/>
+                <w:szCs w:val="20"/>
+              </w:rPr>
+              <w:t xml:space="preserve">Expenditure</w:t>
+            </w:r>
+          </w:p>
+        </w:tc>
+        <w:tc>
+          <w:tcPr>
+            <w:shd/>
+            <w:tcMar>
+              <w:top w:type="dxa" w:w="80"/>
+              <w:left w:type="dxa" w:w="120"/>
+              <w:bottom w:type="dxa" w:w="80"/>
+              <w:right w:type="dxa" w:w="120"/>
+            </w:tcMar>
+          </w:tcPr>
+          <w:p>
+            <w:r>
+              <w:rPr>
+                <w:b w:val="false"/>
+                <w:bCs w:val="false"/>
+                <w:sz w:val="20"/>
+                <w:szCs w:val="20"/>
+              </w:rPr>
+              <w:t xml:space="preserve">Gwariant</w:t>
+            </w:r>
+          </w:p>
+        </w:tc>
+      </w:tr>
+      <w:tr>
+        <w:tc>
+          <w:tcPr>
+            <w:shd/>
+            <w:tcMar>
+              <w:top w:type="dxa" w:w="80"/>
+              <w:left w:type="dxa" w:w="120"/>
+              <w:bottom w:type="dxa" w:w="80"/>
+              <w:right w:type="dxa" w:w="120"/>
+            </w:tcMar>
+          </w:tcPr>
+          <w:p>
+            <w:r>
+              <w:rPr>
+                <w:b w:val="false"/>
+                <w:bCs w:val="false"/>
+                <w:sz w:val="20"/>
+                <w:szCs w:val="20"/>
+              </w:rPr>
+              <w:t xml:space="preserve">All Years</w:t>
+            </w:r>
+          </w:p>
+        </w:tc>
+        <w:tc>
+          <w:tcPr>
+            <w:shd/>
+            <w:tcMar>
+              <w:top w:type="dxa" w:w="80"/>
+              <w:left w:type="dxa" w:w="120"/>
+              <w:bottom w:type="dxa" w:w="80"/>
+              <w:right w:type="dxa" w:w="120"/>
+            </w:tcMar>
+          </w:tcPr>
+          <w:p>
+            <w:r>
+              <w:rPr>
+                <w:b w:val="false"/>
+                <w:bCs w:val="false"/>
+                <w:sz w:val="20"/>
+                <w:szCs w:val="20"/>
+              </w:rPr>
+              <w:t xml:space="preserve">Pob Blwyddyn</w:t>
+            </w:r>
+          </w:p>
+        </w:tc>
+      </w:tr>
+      <w:tr>
+        <w:tc>
+          <w:tcPr>
+            <w:shd/>
+            <w:tcMar>
+              <w:top w:type="dxa" w:w="80"/>
+              <w:left w:type="dxa" w:w="120"/>
+              <w:bottom w:type="dxa" w:w="80"/>
+              <w:right w:type="dxa" w:w="120"/>
+            </w:tcMar>
+          </w:tcPr>
+          <w:p>
+            <w:r>
+              <w:rPr>
+                <w:b w:val="false"/>
+                <w:bCs w:val="false"/>
+                <w:sz w:val="20"/>
+                <w:szCs w:val="20"/>
+              </w:rPr>
+              <w:t xml:space="preserve">Income &amp; Expenditure — Last 3 Years</w:t>
+            </w:r>
+          </w:p>
+        </w:tc>
+        <w:tc>
+          <w:tcPr>
+            <w:shd/>
+            <w:tcMar>
+              <w:top w:type="dxa" w:w="80"/>
+              <w:left w:type="dxa" w:w="120"/>
+              <w:bottom w:type="dxa" w:w="80"/>
+              <w:right w:type="dxa" w:w="120"/>
+            </w:tcMar>
+          </w:tcPr>
+          <w:p>
+            <w:r>
+              <w:rPr>
+                <w:b w:val="false"/>
+                <w:bCs w:val="false"/>
+                <w:sz w:val="20"/>
+                <w:szCs w:val="20"/>
+              </w:rPr>
+              <w:t xml:space="preserve">Incwm a Gwariant — 3 Blynedd Diwethaf</w:t>
             </w:r>
           </w:p>
         </w:tc>

</xml_diff>

<commit_message>
Add Welsh label to fundraising entries; redesign chart to back-to-back horizontal bars
Each fundraising entry now has an optional Welsh label (labelWel). The admin form
has separate English and Welsh name fields. The public breakdown chart is replaced
with two side-by-side horizontal bar charts — income (purple, highest first) on the
left, expenditure (amber, highest first) on the right — filtered by year. Docs updated.

Co-Authored-By: Claude Sonnet 4.6 <noreply@anthropic.com>
</commit_message>
<xml_diff>
--- a/resources/YGGG_PTA_App_Documentation.docx
+++ b/resources/YGGG_PTA_App_Documentation.docx
@@ -5464,75 +5464,109 @@
         </w:rPr>
       </w:pPr>
       <w:r>
-        <w:t xml:space="preserve">Grouped bar chart (Recharts): one bar pair per year — Income (purple) and Expenditure (yellow-amber)</w:t>
-      </w:r>
-    </w:p>
-    <w:p>
-      <w:pPr>
-        <w:pStyle w:val="ListParagraph"/>
-        <w:numPr>
-          <w:ilvl w:val="0"/>
-          <w:numId w:val="1"/>
-        </w:numPr>
-        <w:spacing w:after="60"/>
-        <w:rPr>
-          <w:sz w:val="22"/>
-          <w:szCs w:val="22"/>
-        </w:rPr>
-      </w:pPr>
-      <w:r>
-        <w:t xml:space="preserve">Year filter tabs: All Years / individual years</w:t>
-      </w:r>
-    </w:p>
-    <w:p>
-      <w:pPr>
-        <w:pStyle w:val="ListParagraph"/>
-        <w:numPr>
-          <w:ilvl w:val="0"/>
-          <w:numId w:val="1"/>
-        </w:numPr>
-        <w:spacing w:after="60"/>
-        <w:rPr>
-          <w:sz w:val="22"/>
-          <w:szCs w:val="22"/>
-        </w:rPr>
-      </w:pPr>
-      <w:r>
-        <w:t xml:space="preserve">Detail table: each entry listed by year with type badge (Income / Expenditure) and amount</w:t>
-      </w:r>
-    </w:p>
-    <w:p>
-      <w:pPr>
-        <w:pStyle w:val="ListParagraph"/>
-        <w:numPr>
-          <w:ilvl w:val="0"/>
-          <w:numId w:val="1"/>
-        </w:numPr>
-        <w:spacing w:after="60"/>
-        <w:rPr>
-          <w:sz w:val="22"/>
-          <w:szCs w:val="22"/>
-        </w:rPr>
-      </w:pPr>
-      <w:r>
-        <w:t xml:space="preserve">Row totals per year showing income / expenditure side-by-side</w:t>
-      </w:r>
-    </w:p>
-    <w:p>
-      <w:pPr>
-        <w:pStyle w:val="ListParagraph"/>
-        <w:numPr>
-          <w:ilvl w:val="0"/>
-          <w:numId w:val="1"/>
-        </w:numPr>
-        <w:spacing w:after="60"/>
-        <w:rPr>
-          <w:sz w:val="22"/>
-          <w:szCs w:val="22"/>
-        </w:rPr>
-      </w:pPr>
-      <w:r>
-        <w:t xml:space="preserve">All labels bilingual (English / Welsh)</w:t>
+        <w:t xml:space="preserve">Two side-by-side horizontal bar charts (back-to-back layout)</w:t>
+      </w:r>
+    </w:p>
+    <w:p>
+      <w:pPr>
+        <w:pStyle w:val="ListParagraph"/>
+        <w:numPr>
+          <w:ilvl w:val="0"/>
+          <w:numId w:val="1"/>
+        </w:numPr>
+        <w:spacing w:after="60"/>
+        <w:rPr>
+          <w:sz w:val="22"/>
+          <w:szCs w:val="22"/>
+        </w:rPr>
+      </w:pPr>
+      <w:r>
+        <w:t xml:space="preserve">Left chart: Income entries — horizontal bars sorted highest to lowest, purple</w:t>
+      </w:r>
+    </w:p>
+    <w:p>
+      <w:pPr>
+        <w:pStyle w:val="ListParagraph"/>
+        <w:numPr>
+          <w:ilvl w:val="0"/>
+          <w:numId w:val="1"/>
+        </w:numPr>
+        <w:spacing w:after="60"/>
+        <w:rPr>
+          <w:sz w:val="22"/>
+          <w:szCs w:val="22"/>
+        </w:rPr>
+      </w:pPr>
+      <w:r>
+        <w:t xml:space="preserve">Right chart: Expenditure entries — horizontal bars sorted highest to lowest, amber</w:t>
+      </w:r>
+    </w:p>
+    <w:p>
+      <w:pPr>
+        <w:pStyle w:val="ListParagraph"/>
+        <w:numPr>
+          <w:ilvl w:val="0"/>
+          <w:numId w:val="1"/>
+        </w:numPr>
+        <w:spacing w:after="60"/>
+        <w:rPr>
+          <w:sz w:val="22"/>
+          <w:szCs w:val="22"/>
+        </w:rPr>
+      </w:pPr>
+      <w:r>
+        <w:t xml:space="preserve">Each bar is labelled with the event/item name (Welsh when Welsh mode is active)</w:t>
+      </w:r>
+    </w:p>
+    <w:p>
+      <w:pPr>
+        <w:pStyle w:val="ListParagraph"/>
+        <w:numPr>
+          <w:ilvl w:val="0"/>
+          <w:numId w:val="1"/>
+        </w:numPr>
+        <w:spacing w:after="60"/>
+        <w:rPr>
+          <w:sz w:val="22"/>
+          <w:szCs w:val="22"/>
+        </w:rPr>
+      </w:pPr>
+      <w:r>
+        <w:t xml:space="preserve">Total income and total expenditure shown below each chart</w:t>
+      </w:r>
+    </w:p>
+    <w:p>
+      <w:pPr>
+        <w:pStyle w:val="ListParagraph"/>
+        <w:numPr>
+          <w:ilvl w:val="0"/>
+          <w:numId w:val="1"/>
+        </w:numPr>
+        <w:spacing w:after="60"/>
+        <w:rPr>
+          <w:sz w:val="22"/>
+          <w:szCs w:val="22"/>
+        </w:rPr>
+      </w:pPr>
+      <w:r>
+        <w:t xml:space="preserve">Year filter tabs: All Years / individual years — aggregates entries for selected scope</w:t>
+      </w:r>
+    </w:p>
+    <w:p>
+      <w:pPr>
+        <w:pStyle w:val="ListParagraph"/>
+        <w:numPr>
+          <w:ilvl w:val="0"/>
+          <w:numId w:val="1"/>
+        </w:numPr>
+        <w:spacing w:after="60"/>
+        <w:rPr>
+          <w:sz w:val="22"/>
+          <w:szCs w:val="22"/>
+        </w:rPr>
+      </w:pPr>
+      <w:r>
+        <w:t xml:space="preserve">All labels bilingual (English / Welsh) using labelWel when available</w:t>
       </w:r>
     </w:p>
     <w:p>
@@ -8361,7 +8395,7 @@
                 <w:sz w:val="20"/>
                 <w:szCs w:val="20"/>
               </w:rPr>
-              <w:t xml:space="preserve">Event / Item Name</w:t>
+              <w:t xml:space="preserve">Event / Item Name (English)</w:t>
             </w:r>
           </w:p>
         </w:tc>
@@ -8407,29 +8441,29 @@
                 <w:sz w:val="20"/>
                 <w:szCs w:val="20"/>
               </w:rPr>
-              <w:t xml:space="preserve">Type</w:t>
-            </w:r>
-          </w:p>
-        </w:tc>
-        <w:tc>
-          <w:tcPr>
-            <w:shd/>
-            <w:tcMar>
-              <w:top w:type="dxa" w:w="80"/>
-              <w:left w:type="dxa" w:w="120"/>
-              <w:bottom w:type="dxa" w:w="80"/>
-              <w:right w:type="dxa" w:w="120"/>
-            </w:tcMar>
-          </w:tcPr>
-          <w:p>
-            <w:r>
-              <w:rPr>
-                <w:b w:val="false"/>
-                <w:bCs w:val="false"/>
-                <w:sz w:val="20"/>
-                <w:szCs w:val="20"/>
-              </w:rPr>
-              <w:t xml:space="preserve">Select: Income (Raised) or Expenditure (Spent)</w:t>
+              <w:t xml:space="preserve">Event / Item Name (Welsh)</w:t>
+            </w:r>
+          </w:p>
+        </w:tc>
+        <w:tc>
+          <w:tcPr>
+            <w:shd/>
+            <w:tcMar>
+              <w:top w:type="dxa" w:w="80"/>
+              <w:left w:type="dxa" w:w="120"/>
+              <w:bottom w:type="dxa" w:w="80"/>
+              <w:right w:type="dxa" w:w="120"/>
+            </w:tcMar>
+          </w:tcPr>
+          <w:p>
+            <w:r>
+              <w:rPr>
+                <w:b w:val="false"/>
+                <w:bCs w:val="false"/>
+                <w:sz w:val="20"/>
+                <w:szCs w:val="20"/>
+              </w:rPr>
+              <w:t xml:space="preserve">Optional Welsh translation — e.g. 'Disco yr Haf'</w:t>
             </w:r>
           </w:p>
         </w:tc>
@@ -8453,29 +8487,29 @@
                 <w:sz w:val="20"/>
                 <w:szCs w:val="20"/>
               </w:rPr>
-              <w:t xml:space="preserve">Year</w:t>
-            </w:r>
-          </w:p>
-        </w:tc>
-        <w:tc>
-          <w:tcPr>
-            <w:shd/>
-            <w:tcMar>
-              <w:top w:type="dxa" w:w="80"/>
-              <w:left w:type="dxa" w:w="120"/>
-              <w:bottom w:type="dxa" w:w="80"/>
-              <w:right w:type="dxa" w:w="120"/>
-            </w:tcMar>
-          </w:tcPr>
-          <w:p>
-            <w:r>
-              <w:rPr>
-                <w:b w:val="false"/>
-                <w:bCs w:val="false"/>
-                <w:sz w:val="20"/>
-                <w:szCs w:val="20"/>
-              </w:rPr>
-              <w:t xml:space="preserve">Integer — e.g. 2023, 2024, 2025</w:t>
+              <w:t xml:space="preserve">Type</w:t>
+            </w:r>
+          </w:p>
+        </w:tc>
+        <w:tc>
+          <w:tcPr>
+            <w:shd/>
+            <w:tcMar>
+              <w:top w:type="dxa" w:w="80"/>
+              <w:left w:type="dxa" w:w="120"/>
+              <w:bottom w:type="dxa" w:w="80"/>
+              <w:right w:type="dxa" w:w="120"/>
+            </w:tcMar>
+          </w:tcPr>
+          <w:p>
+            <w:r>
+              <w:rPr>
+                <w:b w:val="false"/>
+                <w:bCs w:val="false"/>
+                <w:sz w:val="20"/>
+                <w:szCs w:val="20"/>
+              </w:rPr>
+              <w:t xml:space="preserve">Select: Income (Raised) or Expenditure (Spent)</w:t>
             </w:r>
           </w:p>
         </w:tc>
@@ -8499,6 +8533,52 @@
                 <w:sz w:val="20"/>
                 <w:szCs w:val="20"/>
               </w:rPr>
+              <w:t xml:space="preserve">Year</w:t>
+            </w:r>
+          </w:p>
+        </w:tc>
+        <w:tc>
+          <w:tcPr>
+            <w:shd/>
+            <w:tcMar>
+              <w:top w:type="dxa" w:w="80"/>
+              <w:left w:type="dxa" w:w="120"/>
+              <w:bottom w:type="dxa" w:w="80"/>
+              <w:right w:type="dxa" w:w="120"/>
+            </w:tcMar>
+          </w:tcPr>
+          <w:p>
+            <w:r>
+              <w:rPr>
+                <w:b w:val="false"/>
+                <w:bCs w:val="false"/>
+                <w:sz w:val="20"/>
+                <w:szCs w:val="20"/>
+              </w:rPr>
+              <w:t xml:space="preserve">Integer — e.g. 2023, 2024, 2025</w:t>
+            </w:r>
+          </w:p>
+        </w:tc>
+      </w:tr>
+      <w:tr>
+        <w:tc>
+          <w:tcPr>
+            <w:shd/>
+            <w:tcMar>
+              <w:top w:type="dxa" w:w="80"/>
+              <w:left w:type="dxa" w:w="120"/>
+              <w:bottom w:type="dxa" w:w="80"/>
+              <w:right w:type="dxa" w:w="120"/>
+            </w:tcMar>
+          </w:tcPr>
+          <w:p>
+            <w:r>
+              <w:rPr>
+                <w:b w:val="false"/>
+                <w:bCs w:val="false"/>
+                <w:sz w:val="20"/>
+                <w:szCs w:val="20"/>
+              </w:rPr>
               <w:t xml:space="preserve">Amount (£)</w:t>
             </w:r>
           </w:p>
@@ -8572,7 +8652,7 @@
         </w:rPr>
       </w:pPr>
       <w:r>
-        <w:t xml:space="preserve">Edit button pre-populates the form with the selected entry</w:t>
+        <w:t xml:space="preserve">Edit button pre-populates the form with the selected entry (including Welsh label)</w:t>
       </w:r>
     </w:p>
     <w:p>
@@ -8624,6 +8704,23 @@
       </w:pPr>
       <w:r>
         <w:t xml:space="preserve">Per-year summary row showing total income vs total expenditure</w:t>
+      </w:r>
+    </w:p>
+    <w:p>
+      <w:pPr>
+        <w:pStyle w:val="ListParagraph"/>
+        <w:numPr>
+          <w:ilvl w:val="0"/>
+          <w:numId w:val="1"/>
+        </w:numPr>
+        <w:spacing w:after="60"/>
+        <w:rPr>
+          <w:sz w:val="22"/>
+          <w:szCs w:val="22"/>
+        </w:rPr>
+      </w:pPr>
+      <w:r>
+        <w:t xml:space="preserve">Welsh label shown as a sub-line under the English label in the table</w:t>
       </w:r>
     </w:p>
     <w:p>
@@ -9575,7 +9672,7 @@
                 <w:sz w:val="20"/>
                 <w:szCs w:val="20"/>
               </w:rPr>
-              <w:t xml:space="preserve">id, label, type ('income'|'expenditure'), year, amount (pence), createdAt</w:t>
+              <w:t xml:space="preserve">id, label, labelWel, type ('income'|'expenditure'), year, amount (pence), createdAt</w:t>
             </w:r>
           </w:p>
         </w:tc>

</xml_diff>

<commit_message>
Use 'Raised' and 'Spent' instead of 'Income' and 'Expenditure' on fundraising page
Display-only change on the public breakdown chart. No schema or admin UI changes.

Co-Authored-By: Claude Sonnet 4.6 <noreply@anthropic.com>
</commit_message>
<xml_diff>
--- a/resources/YGGG_PTA_App_Documentation.docx
+++ b/resources/YGGG_PTA_App_Documentation.docx
@@ -5481,24 +5481,24 @@
         </w:rPr>
       </w:pPr>
       <w:r>
-        <w:t xml:space="preserve">Left chart: Income entries — horizontal bars sorted highest to lowest, purple</w:t>
-      </w:r>
-    </w:p>
-    <w:p>
-      <w:pPr>
-        <w:pStyle w:val="ListParagraph"/>
-        <w:numPr>
-          <w:ilvl w:val="0"/>
-          <w:numId w:val="1"/>
-        </w:numPr>
-        <w:spacing w:after="60"/>
-        <w:rPr>
-          <w:sz w:val="22"/>
-          <w:szCs w:val="22"/>
-        </w:rPr>
-      </w:pPr>
-      <w:r>
-        <w:t xml:space="preserve">Right chart: Expenditure entries — horizontal bars sorted highest to lowest, amber</w:t>
+        <w:t xml:space="preserve">Left chart: 'Raised' — horizontal bars sorted highest to lowest, purple</w:t>
+      </w:r>
+    </w:p>
+    <w:p>
+      <w:pPr>
+        <w:pStyle w:val="ListParagraph"/>
+        <w:numPr>
+          <w:ilvl w:val="0"/>
+          <w:numId w:val="1"/>
+        </w:numPr>
+        <w:spacing w:after="60"/>
+        <w:rPr>
+          <w:sz w:val="22"/>
+          <w:szCs w:val="22"/>
+        </w:rPr>
+      </w:pPr>
+      <w:r>
+        <w:t xml:space="preserve">Right chart: 'Spent' — horizontal bars sorted highest to lowest, amber</w:t>
       </w:r>
     </w:p>
     <w:p>

</xml_diff>